<commit_message>
Fix: Parte 1 del arreglo de los ejemplos de construccion de documento para garantizar que funcione correctamente. En el documento demo de word se pueden ver los pendientes
</commit_message>
<xml_diff>
--- a/tests/demo.docx
+++ b/tests/demo.docx
@@ -4,65 +4,977 @@
   <w:body>
     <w:p>
       <w:pPr>
+        <w:pStyle w:val="Ttulo1"/>
+      </w:pPr>
+      <w:r>
+        <w:t xml:space="preserve">Ejemplo 1: Reemplazo de </w:t>
+      </w:r>
+      <w:r>
+        <w:t>1 variable</w:t>
+      </w:r>
+      <w:r>
+        <w:t xml:space="preserve"> en párrafos</w:t>
+      </w:r>
+    </w:p>
+    <w:p/>
+    <w:p>
+      <w:r>
+        <w:t>Este es un párrafo con estilo “Normal”. Este estilo está configurado para que tenga un pequeño margen al inicio del párrafo. El primer ejemplo reemplazará la siguiente variable &lt;&lt;fecha&gt;&gt; por la fecha del día en que se ejecute la demo.</w:t>
+      </w:r>
+    </w:p>
+    <w:p/>
+    <w:p>
+      <w:pPr>
+        <w:pStyle w:val="Ttulo1"/>
+      </w:pPr>
+      <w:r>
+        <w:t xml:space="preserve">Ejemplo 2: Reemplazo de </w:t>
+      </w:r>
+      <w:r>
+        <w:t xml:space="preserve">varias </w:t>
+      </w:r>
+      <w:r>
+        <w:t>variables respetando formatos y referencias.</w:t>
+      </w:r>
+    </w:p>
+    <w:p>
+      <w:r>
+        <w:t xml:space="preserve">Ahora; reemplazaremos varias variables dentro de un solo párrafo, manteniendo el formato de textos en “Negrita” o “Cursiva”. Además, este texto incluirá una la siguiente referencia cruzada a la sección del . Se nota que el programador de esta librería (el Dr. </w:t>
+      </w:r>
+      <w:r>
+        <w:rPr>
+          <w:lang w:val="es-MX"/>
+        </w:rPr>
+        <w:t>&lt;&lt;</w:t>
+      </w:r>
+      <w:proofErr w:type="spellStart"/>
+      <w:r>
+        <w:rPr>
+          <w:lang w:val="es-MX"/>
+        </w:rPr>
+        <w:t>nombre_</w:t>
+      </w:r>
+      <w:r>
+        <w:rPr>
+          <w:lang w:val="es-MX"/>
+        </w:rPr>
+        <w:t>del_programador</w:t>
+      </w:r>
+      <w:proofErr w:type="spellEnd"/>
+      <w:r>
+        <w:rPr>
+          <w:lang w:val="es-MX"/>
+        </w:rPr>
+        <w:t>&gt;&gt;</w:t>
+      </w:r>
+      <w:r>
+        <w:rPr>
+          <w:lang w:val="es-MX"/>
+        </w:rPr>
+        <w:t>) hizo un gran trabajo al publicarla.</w:t>
+      </w:r>
+    </w:p>
+    <w:p>
+      <w:pPr>
         <w:jc w:val="right"/>
       </w:pPr>
-      <w:r>
-        <w:t>&lt;&lt;fecha&gt;&gt;</w:t>
-      </w:r>
-    </w:p>
-    <w:p>
-      <w:pPr>
-        <w:jc w:val="both"/>
-        <w:rPr>
-          <w:lang w:val="es-MX"/>
-        </w:rPr>
-      </w:pPr>
-    </w:p>
-    <w:p>
-      <w:pPr>
-        <w:rPr>
-          <w:lang w:val="es-MX"/>
-        </w:rPr>
-      </w:pPr>
-      <w:r>
-        <w:rPr>
-          <w:lang w:val="es-MX"/>
-        </w:rPr>
-        <w:t>Estimado: &lt;&lt;</w:t>
+    </w:p>
+    <w:p>
+      <w:pPr>
+        <w:pStyle w:val="Ttulo1"/>
+      </w:pPr>
+      <w:r>
+        <w:t xml:space="preserve">Ejemplo </w:t>
+      </w:r>
+      <w:r>
+        <w:t>3</w:t>
+      </w:r>
+      <w:r>
+        <w:t xml:space="preserve">: </w:t>
+      </w:r>
+      <w:r>
+        <w:t>Reemplazar una variable por todo un párrafo y asignarle un estilo</w:t>
+      </w:r>
+      <w:r>
+        <w:t xml:space="preserve"> a dicho párrafo. </w:t>
+      </w:r>
+    </w:p>
+    <w:p>
+      <w:pPr>
+        <w:rPr>
+          <w:lang w:val="es-MX"/>
+        </w:rPr>
+      </w:pPr>
+      <w:r>
+        <w:rPr>
+          <w:lang w:val="es-MX"/>
+        </w:rPr>
+        <w:t xml:space="preserve">En este ejemplo, haremos algo más interesante. Vamos a </w:t>
+      </w:r>
+      <w:r>
+        <w:rPr>
+          <w:lang w:val="es-MX"/>
+        </w:rPr>
+        <w:t>reemplazar la variable de “</w:t>
       </w:r>
       <w:proofErr w:type="spellStart"/>
       <w:r>
         <w:rPr>
           <w:lang w:val="es-MX"/>
         </w:rPr>
-        <w:t>nombre_de_cliente</w:t>
+        <w:t>párrafos_previos</w:t>
       </w:r>
       <w:proofErr w:type="spellEnd"/>
       <w:r>
         <w:rPr>
           <w:lang w:val="es-MX"/>
         </w:rPr>
+        <w:t>”</w:t>
+      </w:r>
+      <w:r>
+        <w:rPr>
+          <w:lang w:val="es-MX"/>
+        </w:rPr>
+        <w:t xml:space="preserve"> </w:t>
+      </w:r>
+      <w:r>
+        <w:rPr>
+          <w:lang w:val="es-MX"/>
+        </w:rPr>
+        <w:t xml:space="preserve">por </w:t>
+      </w:r>
+      <w:r>
+        <w:rPr>
+          <w:lang w:val="es-MX"/>
+        </w:rPr>
+        <w:t xml:space="preserve">varios </w:t>
+      </w:r>
+      <w:r>
+        <w:rPr>
+          <w:lang w:val="es-MX"/>
+        </w:rPr>
+        <w:t xml:space="preserve">3 </w:t>
+      </w:r>
+      <w:r>
+        <w:rPr>
+          <w:lang w:val="es-MX"/>
+        </w:rPr>
+        <w:t>párrafos enteros</w:t>
+      </w:r>
+      <w:r>
+        <w:rPr>
+          <w:lang w:val="es-MX"/>
+        </w:rPr>
+        <w:t xml:space="preserve"> escritos directamente desde el código donde se usarán las variables “fecha” y “</w:t>
+      </w:r>
+      <w:proofErr w:type="spellStart"/>
+      <w:r>
+        <w:rPr>
+          <w:lang w:val="es-MX"/>
+        </w:rPr>
+        <w:t>nombre_del_programador</w:t>
+      </w:r>
+      <w:proofErr w:type="spellEnd"/>
+      <w:r>
+        <w:rPr>
+          <w:lang w:val="es-MX"/>
+        </w:rPr>
+        <w:t>”;</w:t>
+      </w:r>
+      <w:r>
+        <w:rPr>
+          <w:lang w:val="es-MX"/>
+        </w:rPr>
+        <w:t xml:space="preserve"> incluso, pondremos la separación entre ellos. </w:t>
+      </w:r>
+    </w:p>
+    <w:p>
+      <w:pPr>
+        <w:rPr>
+          <w:lang w:val="es-MX"/>
+        </w:rPr>
+      </w:pPr>
+    </w:p>
+    <w:p>
+      <w:pPr>
+        <w:pStyle w:val="Normalsinsangria"/>
+      </w:pPr>
+      <w:r>
+        <w:t>&lt;&lt;</w:t>
+      </w:r>
+      <w:proofErr w:type="spellStart"/>
+      <w:r>
+        <w:t>parrafos_previos</w:t>
+      </w:r>
+      <w:proofErr w:type="spellEnd"/>
+      <w:r>
         <w:t>&gt;&gt;</w:t>
       </w:r>
     </w:p>
     <w:p>
       <w:pPr>
-        <w:rPr>
-          <w:lang w:val="es-MX"/>
-        </w:rPr>
-      </w:pPr>
-    </w:p>
-    <w:p>
-      <w:pPr>
-        <w:rPr>
-          <w:lang w:val="es-MX"/>
-        </w:rPr>
-      </w:pPr>
-      <w:r>
-        <w:rPr>
-          <w:lang w:val="es-MX"/>
-        </w:rPr>
-        <w:t xml:space="preserve">Ud. fue </w:t>
+        <w:pStyle w:val="Ttulo1"/>
+        <w:rPr>
+          <w:lang w:val="es-MX"/>
+        </w:rPr>
+      </w:pPr>
+      <w:r>
+        <w:rPr>
+          <w:lang w:val="es-MX"/>
+        </w:rPr>
+        <w:t>Ejemplo 4: Insertar una lista</w:t>
+      </w:r>
+    </w:p>
+    <w:p>
+      <w:pPr>
+        <w:rPr>
+          <w:lang w:val="es-MX"/>
+        </w:rPr>
+      </w:pPr>
+      <w:r>
+        <w:rPr>
+          <w:lang w:val="es-MX"/>
+        </w:rPr>
+        <w:t>Ahora, veamos cómo insertar una lista. Vale la pena mencionar que h</w:t>
+      </w:r>
+      <w:r>
+        <w:rPr>
+          <w:lang w:val="es-MX"/>
+        </w:rPr>
+        <w:t xml:space="preserve">asta </w:t>
+      </w:r>
+      <w:r>
+        <w:rPr>
+          <w:lang w:val="es-MX"/>
+        </w:rPr>
+        <w:t xml:space="preserve">esta versión </w:t>
+      </w:r>
+      <w:r>
+        <w:rPr>
+          <w:lang w:val="es-MX"/>
+        </w:rPr>
+        <w:t xml:space="preserve">solo </w:t>
+      </w:r>
+      <w:r>
+        <w:rPr>
+          <w:lang w:val="es-MX"/>
+        </w:rPr>
+        <w:t xml:space="preserve">se puede insertar un solo nivel </w:t>
+      </w:r>
+      <w:proofErr w:type="spellStart"/>
+      <w:r>
+        <w:rPr>
+          <w:lang w:val="es-MX"/>
+        </w:rPr>
+        <w:t>nivel</w:t>
+      </w:r>
+      <w:proofErr w:type="spellEnd"/>
+      <w:r>
+        <w:rPr>
+          <w:lang w:val="es-MX"/>
+        </w:rPr>
+        <w:t>. En el futuro se incluirán subniveles</w:t>
+      </w:r>
+      <w:r>
+        <w:rPr>
+          <w:lang w:val="es-MX"/>
+        </w:rPr>
+        <w:t>; y el estilo de la lista debe estar guardado en el documento; en este caso el estilo se llama “</w:t>
+      </w:r>
+      <w:proofErr w:type="spellStart"/>
+      <w:r>
+        <w:rPr>
+          <w:lang w:val="es-MX"/>
+        </w:rPr>
+        <w:t>lista_no_numerada</w:t>
+      </w:r>
+      <w:proofErr w:type="spellEnd"/>
+      <w:r>
+        <w:rPr>
+          <w:lang w:val="es-MX"/>
+        </w:rPr>
+        <w:t xml:space="preserve">”. Fíjate que en el documento la variable tiene estilo </w:t>
+      </w:r>
+      <w:proofErr w:type="spellStart"/>
+      <w:r>
+        <w:rPr>
+          <w:lang w:val="es-MX"/>
+        </w:rPr>
+        <w:t>Normal_sin_sangria</w:t>
+      </w:r>
+      <w:proofErr w:type="spellEnd"/>
+      <w:r>
+        <w:rPr>
+          <w:lang w:val="es-MX"/>
+        </w:rPr>
+        <w:t>, el estilo puesto desde el código será el que domin</w:t>
+      </w:r>
+      <w:r>
+        <w:rPr>
+          <w:lang w:val="es-MX"/>
+        </w:rPr>
+        <w:t>e en el documento final</w:t>
+      </w:r>
+      <w:r>
+        <w:rPr>
+          <w:lang w:val="es-MX"/>
+        </w:rPr>
+        <w:t>.</w:t>
+      </w:r>
+    </w:p>
+    <w:p>
+      <w:pPr>
+        <w:ind w:firstLine="0"/>
+        <w:rPr>
+          <w:lang w:val="es-MX"/>
+        </w:rPr>
+      </w:pPr>
+    </w:p>
+    <w:p>
+      <w:pPr>
+        <w:pStyle w:val="Normalsinsangria"/>
+      </w:pPr>
+      <w:r>
+        <w:t>&lt;&lt;</w:t>
+      </w:r>
+      <w:proofErr w:type="spellStart"/>
+      <w:r>
+        <w:t>li</w:t>
+      </w:r>
+      <w:r>
+        <w:t>sta_ejemplo</w:t>
+      </w:r>
+      <w:proofErr w:type="spellEnd"/>
+      <w:r>
+        <w:t>&gt;&gt;</w:t>
+      </w:r>
+    </w:p>
+    <w:p>
+      <w:pPr>
+        <w:pStyle w:val="Ttulo1"/>
+        <w:rPr>
+          <w:lang w:val="es-MX"/>
+        </w:rPr>
+      </w:pPr>
+      <w:bookmarkStart w:id="0" w:name="_Ref241251931"/>
+      <w:r>
+        <w:rPr>
+          <w:lang w:val="es-MX"/>
+        </w:rPr>
+        <w:lastRenderedPageBreak/>
+        <w:t>Ejemplo 5: Insertar una figura sin título</w:t>
+      </w:r>
+      <w:bookmarkEnd w:id="0"/>
+    </w:p>
+    <w:p>
+      <w:pPr>
+        <w:rPr>
+          <w:lang w:val="es-MX"/>
+        </w:rPr>
+      </w:pPr>
+      <w:r>
+        <w:rPr>
+          <w:lang w:val="es-MX"/>
+        </w:rPr>
+        <w:t xml:space="preserve">Cuando se inserta una figura; se debe seguir una estructura, la cual se muestra en código. En este ejemplo, se inserta la </w:t>
+      </w:r>
+      <w:r>
+        <w:rPr>
+          <w:lang w:val="es-MX"/>
+        </w:rPr>
+        <w:fldChar w:fldCharType="begin"/>
+      </w:r>
+      <w:r>
+        <w:rPr>
+          <w:lang w:val="es-MX"/>
+        </w:rPr>
+        <w:instrText xml:space="preserve"> REF _Ref231395923 \h </w:instrText>
+      </w:r>
+      <w:r>
+        <w:rPr>
+          <w:lang w:val="es-MX"/>
+        </w:rPr>
+      </w:r>
+      <w:r>
+        <w:rPr>
+          <w:lang w:val="es-MX"/>
+        </w:rPr>
+        <w:fldChar w:fldCharType="separate"/>
+      </w:r>
+      <w:r>
+        <w:t xml:space="preserve">Figura </w:t>
+      </w:r>
+      <w:r>
+        <w:rPr>
+          <w:noProof/>
+        </w:rPr>
+        <w:t>1</w:t>
+      </w:r>
+      <w:r>
+        <w:rPr>
+          <w:lang w:val="es-MX"/>
+        </w:rPr>
+        <w:fldChar w:fldCharType="end"/>
+      </w:r>
+      <w:r>
+        <w:rPr>
+          <w:lang w:val="es-MX"/>
+        </w:rPr>
+        <w:t xml:space="preserve">; la cual ya tiene título (fíjate debajo de la variable, verás que Figura 1 es el </w:t>
+      </w:r>
+      <w:proofErr w:type="spellStart"/>
+      <w:r>
+        <w:rPr>
+          <w:lang w:val="es-MX"/>
+        </w:rPr>
+        <w:t>bookmark</w:t>
+      </w:r>
+      <w:proofErr w:type="spellEnd"/>
+      <w:r>
+        <w:rPr>
+          <w:lang w:val="es-MX"/>
+        </w:rPr>
+        <w:t xml:space="preserve">. Para agregar este título, inserta cualquier figura que quieras y presiona </w:t>
+      </w:r>
+      <w:proofErr w:type="spellStart"/>
+      <w:r>
+        <w:rPr>
+          <w:lang w:val="es-MX"/>
+        </w:rPr>
+        <w:t>click</w:t>
+      </w:r>
+      <w:proofErr w:type="spellEnd"/>
+      <w:r>
+        <w:rPr>
+          <w:lang w:val="es-MX"/>
+        </w:rPr>
+        <w:t xml:space="preserve"> derecho y presiona donde dice “insertar título”; luego borra esa figura y coloca la variable)</w:t>
+      </w:r>
+    </w:p>
+    <w:p>
+      <w:pPr>
+        <w:rPr>
+          <w:u w:val="single"/>
+          <w:lang w:val="es-MX"/>
+        </w:rPr>
+      </w:pPr>
+      <w:r>
+        <w:rPr>
+          <w:lang w:val="es-MX"/>
+        </w:rPr>
+        <w:t>&lt;&lt;</w:t>
+      </w:r>
+      <w:proofErr w:type="spellStart"/>
+      <w:r>
+        <w:rPr>
+          <w:lang w:val="es-MX"/>
+        </w:rPr>
+        <w:t>fig_sin_titulo</w:t>
+      </w:r>
+      <w:proofErr w:type="spellEnd"/>
+      <w:r>
+        <w:rPr>
+          <w:lang w:val="es-MX"/>
+        </w:rPr>
+        <w:t>&gt;&gt;</w:t>
+      </w:r>
+    </w:p>
+    <w:p>
+      <w:pPr>
+        <w:pStyle w:val="Carcentrado"/>
+        <w:rPr>
+          <w:lang w:val="es-MX"/>
+        </w:rPr>
+      </w:pPr>
+      <w:r>
+        <w:t xml:space="preserve">Figura </w:t>
+      </w:r>
+      <w:r>
+        <w:fldChar w:fldCharType="begin"/>
+      </w:r>
+      <w:r>
+        <w:instrText xml:space="preserve"> SEQ Figura \* ARABIC </w:instrText>
+      </w:r>
+      <w:r>
+        <w:fldChar w:fldCharType="separate"/>
+      </w:r>
+      <w:r>
+        <w:rPr>
+          <w:noProof/>
+        </w:rPr>
+        <w:t>1</w:t>
+      </w:r>
+      <w:r>
+        <w:fldChar w:fldCharType="end"/>
+      </w:r>
+      <w:r>
+        <w:t>. Ejemplo de figura. Con la variable del programador &lt;&lt;</w:t>
+      </w:r>
+      <w:proofErr w:type="spellStart"/>
+      <w:r>
+        <w:t>nombre_del_programador</w:t>
+      </w:r>
+      <w:proofErr w:type="spellEnd"/>
+      <w:r>
+        <w:t>&gt;&gt;</w:t>
+      </w:r>
+    </w:p>
+    <w:p>
+      <w:pPr>
+        <w:rPr>
+          <w:lang w:val="es-MX"/>
+        </w:rPr>
+      </w:pPr>
+    </w:p>
+    <w:p>
+      <w:pPr>
+        <w:rPr>
+          <w:lang w:val="es-MX"/>
+        </w:rPr>
+      </w:pPr>
+      <w:r>
+        <w:rPr>
+          <w:lang w:val="es-MX"/>
+        </w:rPr>
+        <w:t xml:space="preserve">Fíjate que, </w:t>
+      </w:r>
+      <w:r>
+        <w:rPr>
+          <w:lang w:val="es-MX"/>
+        </w:rPr>
+        <w:t>la variable “</w:t>
+      </w:r>
+      <w:proofErr w:type="spellStart"/>
+      <w:r>
+        <w:rPr>
+          <w:lang w:val="es-MX"/>
+        </w:rPr>
+        <w:t>fig_sin_titulo</w:t>
+      </w:r>
+      <w:proofErr w:type="spellEnd"/>
+      <w:r>
+        <w:rPr>
+          <w:lang w:val="es-MX"/>
+        </w:rPr>
+        <w:t>” tiene asignado el estilo</w:t>
+      </w:r>
+      <w:r>
+        <w:rPr>
+          <w:lang w:val="es-MX"/>
+        </w:rPr>
+        <w:t xml:space="preserve"> “</w:t>
+      </w:r>
+      <w:r>
+        <w:rPr>
+          <w:lang w:val="es-MX"/>
+        </w:rPr>
+        <w:t>Normal</w:t>
+      </w:r>
+      <w:r>
+        <w:rPr>
+          <w:lang w:val="es-MX"/>
+        </w:rPr>
+        <w:t>”</w:t>
+      </w:r>
+      <w:r>
+        <w:rPr>
+          <w:lang w:val="es-MX"/>
+        </w:rPr>
+        <w:t xml:space="preserve"> pero</w:t>
+      </w:r>
+      <w:r>
+        <w:rPr>
+          <w:lang w:val="es-MX"/>
+        </w:rPr>
+        <w:t>; recuerda que el estilo que prevalece será el del código</w:t>
+      </w:r>
+      <w:r>
+        <w:rPr>
+          <w:lang w:val="es-MX"/>
+        </w:rPr>
+        <w:t xml:space="preserve">, y en </w:t>
+      </w:r>
+      <w:proofErr w:type="spellStart"/>
+      <w:r>
+        <w:rPr>
+          <w:lang w:val="es-MX"/>
+        </w:rPr>
+        <w:t>el</w:t>
+      </w:r>
+      <w:proofErr w:type="spellEnd"/>
+      <w:r>
+        <w:rPr>
+          <w:lang w:val="es-MX"/>
+        </w:rPr>
+        <w:t xml:space="preserve"> código le puse estilo “Figura” el cual es un estilo centrado. </w:t>
+      </w:r>
+      <w:r>
+        <w:rPr>
+          <w:lang w:val="es-MX"/>
+        </w:rPr>
+        <w:t xml:space="preserve"> </w:t>
+      </w:r>
+      <w:r>
+        <w:rPr>
+          <w:lang w:val="es-MX"/>
+        </w:rPr>
+        <w:t xml:space="preserve">Y si te estás preguntando si se pueden poner estilos a todo; la respuesta es que </w:t>
+      </w:r>
+      <w:r>
+        <w:rPr>
+          <w:lang w:val="es-MX"/>
+        </w:rPr>
+        <w:t>a casi todas las variables les podemos poner un estilo dentro del código. Eso i</w:t>
+      </w:r>
+      <w:r>
+        <w:rPr>
+          <w:lang w:val="es-MX"/>
+        </w:rPr>
+        <w:t xml:space="preserve">ncluye el título de la figura. A este título le puse “Normal” en la plantilla; pero en código </w:t>
+      </w:r>
+      <w:proofErr w:type="spellStart"/>
+      <w:r>
+        <w:rPr>
+          <w:lang w:val="es-MX"/>
+        </w:rPr>
+        <w:t>user</w:t>
+      </w:r>
+      <w:proofErr w:type="spellEnd"/>
+      <w:r>
+        <w:rPr>
+          <w:lang w:val="es-MX"/>
+        </w:rPr>
+        <w:t xml:space="preserve"> “</w:t>
+      </w:r>
+      <w:proofErr w:type="spellStart"/>
+      <w:r>
+        <w:rPr>
+          <w:lang w:val="es-MX"/>
+        </w:rPr>
+        <w:t>Carcentrado</w:t>
+      </w:r>
+      <w:proofErr w:type="spellEnd"/>
+      <w:r>
+        <w:rPr>
+          <w:lang w:val="es-MX"/>
+        </w:rPr>
+        <w:t>”. No le puse  “</w:t>
+      </w:r>
+      <w:proofErr w:type="spellStart"/>
+      <w:r>
+        <w:rPr>
+          <w:lang w:val="es-MX"/>
+        </w:rPr>
+        <w:t>Car_centrado</w:t>
+      </w:r>
+      <w:proofErr w:type="spellEnd"/>
+      <w:r>
+        <w:rPr>
+          <w:lang w:val="es-MX"/>
+        </w:rPr>
+        <w:t>” porque internamente Word elimina los “_”.</w:t>
+      </w:r>
+    </w:p>
+    <w:p>
+      <w:pPr>
+        <w:rPr>
+          <w:lang w:val="es-MX"/>
+        </w:rPr>
+      </w:pPr>
+    </w:p>
+    <w:p>
+      <w:pPr>
+        <w:rPr>
+          <w:lang w:val="es-MX"/>
+        </w:rPr>
+      </w:pPr>
+      <w:r>
+        <w:rPr>
+          <w:lang w:val="es-MX"/>
+        </w:rPr>
+        <w:t>Otra cosa importante; para insertar una figura la variable, OBLIGATORIAMENTE, debe comenzar con “</w:t>
+      </w:r>
+      <w:proofErr w:type="spellStart"/>
+      <w:r>
+        <w:rPr>
+          <w:lang w:val="es-MX"/>
+        </w:rPr>
+        <w:t>fig</w:t>
+      </w:r>
+      <w:proofErr w:type="spellEnd"/>
+      <w:r>
+        <w:rPr>
+          <w:lang w:val="es-MX"/>
+        </w:rPr>
+        <w:t>”; ejemplo: &lt;&lt;</w:t>
+      </w:r>
+      <w:proofErr w:type="spellStart"/>
+      <w:r>
+        <w:rPr>
+          <w:lang w:val="es-MX"/>
+        </w:rPr>
+        <w:t>fig_nombrequegustes</w:t>
+      </w:r>
+      <w:proofErr w:type="spellEnd"/>
+      <w:r>
+        <w:rPr>
+          <w:lang w:val="es-MX"/>
+        </w:rPr>
+        <w:t>&gt;&gt;</w:t>
+      </w:r>
+    </w:p>
+    <w:p>
+      <w:pPr>
+        <w:pStyle w:val="Ttulo1"/>
+        <w:rPr>
+          <w:lang w:val="es-MX"/>
+        </w:rPr>
+      </w:pPr>
+      <w:r>
+        <w:rPr>
+          <w:lang w:val="es-MX"/>
+        </w:rPr>
+        <w:t>Ejemplo 6: Insertar una figura con título y agregar la referencia en un párrafo.</w:t>
+      </w:r>
+    </w:p>
+    <w:p>
+      <w:pPr>
+        <w:rPr>
+          <w:lang w:val="es-MX"/>
+        </w:rPr>
+      </w:pPr>
+      <w:r>
+        <w:rPr>
+          <w:lang w:val="es-MX"/>
+        </w:rPr>
+        <w:t>Ahora</w:t>
+      </w:r>
+      <w:r>
+        <w:rPr>
+          <w:lang w:val="es-MX"/>
+        </w:rPr>
+        <w:t>,</w:t>
+      </w:r>
+      <w:r>
+        <w:rPr>
+          <w:lang w:val="es-MX"/>
+        </w:rPr>
+        <w:t xml:space="preserve"> </w:t>
+      </w:r>
+      <w:r>
+        <w:rPr>
+          <w:lang w:val="es-MX"/>
+        </w:rPr>
+        <w:t xml:space="preserve">hagamos un ejemplo de insertar una referencia a una figura a la cual yo le asigno un título. </w:t>
+      </w:r>
+    </w:p>
+    <w:p>
+      <w:pPr>
+        <w:rPr>
+          <w:lang w:val="es-MX"/>
+        </w:rPr>
+      </w:pPr>
+      <w:r>
+        <w:rPr>
+          <w:lang w:val="es-MX"/>
+        </w:rPr>
+        <w:t xml:space="preserve">A continuación, en la </w:t>
+      </w:r>
+      <w:r>
+        <w:rPr>
+          <w:lang w:val="es-MX"/>
+        </w:rPr>
+        <w:t>&lt;&lt;</w:t>
+      </w:r>
+      <w:proofErr w:type="spellStart"/>
+      <w:r>
+        <w:rPr>
+          <w:lang w:val="es-MX"/>
+        </w:rPr>
+        <w:t>reffigura_contitulo</w:t>
+      </w:r>
+      <w:proofErr w:type="spellEnd"/>
+      <w:r>
+        <w:rPr>
+          <w:lang w:val="es-MX"/>
+        </w:rPr>
+        <w:t>&gt;&gt;</w:t>
+      </w:r>
+      <w:r>
+        <w:rPr>
+          <w:lang w:val="es-MX"/>
+        </w:rPr>
+        <w:t xml:space="preserve"> se muestra la foto de una niña.</w:t>
+      </w:r>
+    </w:p>
+    <w:p>
+      <w:pPr>
+        <w:pStyle w:val="Figura"/>
+      </w:pPr>
+      <w:r>
+        <w:t>&lt;&lt;</w:t>
+      </w:r>
+      <w:proofErr w:type="spellStart"/>
+      <w:r>
+        <w:t>fig_contitulo</w:t>
+      </w:r>
+      <w:proofErr w:type="spellEnd"/>
+      <w:r>
+        <w:t>&gt;&gt;</w:t>
+      </w:r>
+    </w:p>
+    <w:p>
+      <w:pPr>
+        <w:spacing w:line="240" w:lineRule="auto"/>
+        <w:jc w:val="center"/>
+        <w:rPr>
+          <w:lang w:val="es-MX"/>
+        </w:rPr>
+      </w:pPr>
+    </w:p>
+    <w:p>
+      <w:pPr>
+        <w:rPr>
+          <w:lang w:val="es-MX"/>
+        </w:rPr>
+      </w:pPr>
+      <w:r>
+        <w:rPr>
+          <w:lang w:val="es-MX"/>
+        </w:rPr>
+        <w:t>Para que la referencia se inserte; ésta debe iniciar con la palabra clave “</w:t>
+      </w:r>
+      <w:proofErr w:type="spellStart"/>
+      <w:r>
+        <w:rPr>
+          <w:lang w:val="es-MX"/>
+        </w:rPr>
+        <w:t>reffigura</w:t>
+      </w:r>
+      <w:proofErr w:type="spellEnd"/>
+      <w:r>
+        <w:rPr>
+          <w:lang w:val="es-MX"/>
+        </w:rPr>
+        <w:t>_”</w:t>
+      </w:r>
+      <w:r>
+        <w:rPr>
+          <w:lang w:val="es-MX"/>
+        </w:rPr>
+        <w:t xml:space="preserve"> </w:t>
+      </w:r>
+      <w:r>
+        <w:rPr>
+          <w:lang w:val="es-MX"/>
+        </w:rPr>
+        <w:t>seguido del nombre que le pondrás a la figura. El nombre que elijas debes respetarlo siempre a lo largo de todo el documento, con mayúsculas y minúsculas</w:t>
+      </w:r>
+      <w:r>
+        <w:rPr>
+          <w:lang w:val="es-MX"/>
+        </w:rPr>
+        <w:t>.</w:t>
+      </w:r>
+      <w:r>
+        <w:rPr>
+          <w:lang w:val="es-MX"/>
+        </w:rPr>
+        <w:t xml:space="preserve"> </w:t>
+      </w:r>
+    </w:p>
+    <w:p>
+      <w:pPr>
+        <w:spacing w:line="240" w:lineRule="auto"/>
+        <w:rPr>
+          <w:lang w:val="es-MX"/>
+        </w:rPr>
+      </w:pPr>
+    </w:p>
+    <w:p>
+      <w:pPr>
+        <w:rPr>
+          <w:lang w:val="es-MX"/>
+        </w:rPr>
+      </w:pPr>
+      <w:r>
+        <w:rPr>
+          <w:lang w:val="es-MX"/>
+        </w:rPr>
+        <w:t xml:space="preserve">Puedes </w:t>
+      </w:r>
+      <w:r>
+        <w:rPr>
+          <w:lang w:val="es-MX"/>
+        </w:rPr>
+        <w:t xml:space="preserve">reutilizar la misma referencia muchas veces a lo largo de todo el documento, como lo hago acá </w:t>
+      </w:r>
+      <w:r>
+        <w:rPr>
+          <w:lang w:val="es-MX"/>
+        </w:rPr>
+        <w:t>&lt;&lt;</w:t>
+      </w:r>
+      <w:proofErr w:type="spellStart"/>
+      <w:r>
+        <w:rPr>
+          <w:lang w:val="es-MX"/>
+        </w:rPr>
+        <w:t>reffigura_contitulo</w:t>
+      </w:r>
+      <w:proofErr w:type="spellEnd"/>
+      <w:r>
+        <w:rPr>
+          <w:lang w:val="es-MX"/>
+        </w:rPr>
+        <w:t>&gt;&gt;.</w:t>
+      </w:r>
+      <w:r>
+        <w:rPr>
+          <w:lang w:val="es-MX"/>
+        </w:rPr>
+        <w:t xml:space="preserve"> Y recordando lo que se explicó en la sección del </w:t>
+      </w:r>
+      <w:r>
+        <w:rPr>
+          <w:lang w:val="es-MX"/>
+        </w:rPr>
+        <w:fldChar w:fldCharType="begin"/>
+      </w:r>
+      <w:r>
+        <w:rPr>
+          <w:lang w:val="es-MX"/>
+        </w:rPr>
+        <w:instrText xml:space="preserve"> REF _Ref241251931 \h </w:instrText>
+      </w:r>
+      <w:r>
+        <w:rPr>
+          <w:lang w:val="es-MX"/>
+        </w:rPr>
+      </w:r>
+      <w:r>
+        <w:rPr>
+          <w:lang w:val="es-MX"/>
+        </w:rPr>
+        <w:fldChar w:fldCharType="separate"/>
+      </w:r>
+      <w:r>
+        <w:rPr>
+          <w:lang w:val="es-MX"/>
+        </w:rPr>
+        <w:t>Ejemplo 5: Insertar una figura sin título</w:t>
+      </w:r>
+      <w:r>
+        <w:rPr>
+          <w:lang w:val="es-MX"/>
+        </w:rPr>
+        <w:fldChar w:fldCharType="end"/>
+      </w:r>
+      <w:r>
+        <w:rPr>
+          <w:lang w:val="es-MX"/>
+        </w:rPr>
+        <w:t xml:space="preserve">; les </w:t>
       </w:r>
       <w:r>
         <w:rPr>
@@ -70,45 +982,154 @@
           <w:bCs/>
           <w:lang w:val="es-MX"/>
         </w:rPr>
-        <w:t>seleccionado por ser el mejor editor de código</w:t>
-      </w:r>
-      <w:r>
-        <w:rPr>
-          <w:lang w:val="es-MX"/>
-        </w:rPr>
-        <w:t xml:space="preserve"> durante el &lt;&lt;mes&gt;&gt; del &lt;&lt;</w:t>
+        <w:t xml:space="preserve">puedes poner el estilo que gustes. </w:t>
+      </w:r>
+      <w:r>
+        <w:rPr>
+          <w:lang w:val="es-MX"/>
+        </w:rPr>
+        <w:t>En este caso decidí hacer que desde el código se elija que tipo de estilo usar dependiendo de la longitud del título;</w:t>
+      </w:r>
+      <w:r>
+        <w:rPr>
+          <w:b/>
+          <w:bCs/>
+          <w:lang w:val="es-MX"/>
+        </w:rPr>
+        <w:t xml:space="preserve"> si el título tiene más de 150 letras; se usará el estilo “</w:t>
       </w:r>
       <w:proofErr w:type="spellStart"/>
       <w:r>
         <w:rPr>
-          <w:lang w:val="es-MX"/>
-        </w:rPr>
-        <w:t>anio</w:t>
+          <w:b/>
+          <w:bCs/>
+          <w:lang w:val="es-MX"/>
+        </w:rPr>
+        <w:t>Carjustificado</w:t>
       </w:r>
       <w:proofErr w:type="spellEnd"/>
       <w:r>
         <w:rPr>
-          <w:lang w:val="es-MX"/>
-        </w:rPr>
-        <w:t xml:space="preserve">&gt;&gt;. La creación del </w:t>
+          <w:b/>
+          <w:bCs/>
+          <w:lang w:val="es-MX"/>
+        </w:rPr>
+        <w:t>”, si la longitud del título es de menos de 150 letras, se usará el estilo “</w:t>
       </w:r>
       <w:proofErr w:type="spellStart"/>
       <w:r>
         <w:rPr>
-          <w:lang w:val="es-MX"/>
-        </w:rPr>
-        <w:t>framework</w:t>
+          <w:b/>
+          <w:bCs/>
+          <w:lang w:val="es-MX"/>
+        </w:rPr>
+        <w:t>Carcentrado</w:t>
       </w:r>
       <w:proofErr w:type="spellEnd"/>
       <w:r>
         <w:rPr>
-          <w:lang w:val="es-MX"/>
-        </w:rPr>
-        <w:t xml:space="preserve"> es asombroso.</w:t>
-      </w:r>
-    </w:p>
-    <w:p>
-      <w:pPr>
+          <w:b/>
+          <w:bCs/>
+          <w:lang w:val="es-MX"/>
+        </w:rPr>
+        <w:t>”.</w:t>
+      </w:r>
+    </w:p>
+    <w:p>
+      <w:pPr>
+        <w:spacing w:line="240" w:lineRule="auto"/>
+        <w:rPr>
+          <w:lang w:val="es-MX"/>
+        </w:rPr>
+      </w:pPr>
+    </w:p>
+    <w:p>
+      <w:pPr>
+        <w:pStyle w:val="Ttulo1"/>
+        <w:rPr>
+          <w:lang w:val="es-MX"/>
+        </w:rPr>
+      </w:pPr>
+      <w:r>
+        <w:rPr>
+          <w:lang w:val="es-MX"/>
+        </w:rPr>
+        <w:lastRenderedPageBreak/>
+        <w:t>Ejemplo 7: Rellenar una tabla existente</w:t>
+      </w:r>
+    </w:p>
+    <w:p>
+      <w:pPr>
+        <w:rPr>
+          <w:lang w:val="es-MX"/>
+        </w:rPr>
+      </w:pPr>
+      <w:r>
+        <w:rPr>
+          <w:lang w:val="es-MX"/>
+        </w:rPr>
+        <w:t>En este ejemplo vamos a rellenar una tabla que ya existe.</w:t>
+      </w:r>
+    </w:p>
+    <w:p>
+      <w:pPr>
+        <w:rPr>
+          <w:lang w:val="es-MX"/>
+        </w:rPr>
+      </w:pPr>
+    </w:p>
+    <w:p>
+      <w:pPr>
+        <w:pStyle w:val="Ttulo1"/>
+        <w:rPr>
+          <w:lang w:val="es-MX"/>
+        </w:rPr>
+      </w:pPr>
+      <w:r>
+        <w:rPr>
+          <w:lang w:val="es-MX"/>
+        </w:rPr>
+        <w:t>Ejemplo 8: Reemplazar una variable por una tabla con referencia o sin referencia</w:t>
+      </w:r>
+    </w:p>
+    <w:p>
+      <w:pPr>
+        <w:rPr>
+          <w:lang w:val="es-MX"/>
+        </w:rPr>
+      </w:pPr>
+      <w:r>
+        <w:rPr>
+          <w:lang w:val="es-MX"/>
+        </w:rPr>
+        <w:t>Las tablas y las figuras funcionan de manera similar a las figuras; es decir, puedes tener la referencia previamente insertada y el título preparado (caso del ejemplo 5); o puedes construir referencia y título desde cero. Igualmente; puedes elegir el estilo del título y de la tabla en general. En este ejemplo solo haremos la construcción total de la tabla pues es el más complejo.</w:t>
+      </w:r>
+    </w:p>
+    <w:p>
+      <w:pPr>
+        <w:spacing w:line="240" w:lineRule="auto"/>
+        <w:rPr>
+          <w:lang w:val="es-MX"/>
+        </w:rPr>
+      </w:pPr>
+    </w:p>
+    <w:p>
+      <w:pPr>
+        <w:spacing w:line="240" w:lineRule="auto"/>
+        <w:rPr>
+          <w:lang w:val="es-MX"/>
+        </w:rPr>
+      </w:pPr>
+      <w:r>
+        <w:rPr>
+          <w:lang w:val="es-MX"/>
+        </w:rPr>
+        <w:t>Ahora inserto una tabla con su referencia &lt;&lt;reftabla_tabla1&gt;&gt;</w:t>
+      </w:r>
+    </w:p>
+    <w:p>
+      <w:pPr>
+        <w:spacing w:line="240" w:lineRule="auto"/>
         <w:rPr>
           <w:lang w:val="es-MX"/>
         </w:rPr>
@@ -126,14 +1147,18 @@
         </w:rPr>
         <w:t>&lt;&lt;</w:t>
       </w:r>
-      <w:proofErr w:type="spellStart"/>
-      <w:r>
-        <w:rPr>
-          <w:lang w:val="es-MX"/>
-        </w:rPr>
-        <w:t>parrafos_previos</w:t>
-      </w:r>
-      <w:proofErr w:type="spellEnd"/>
+      <w:r>
+        <w:rPr>
+          <w:lang w:val="es-MX"/>
+        </w:rPr>
+        <w:t>nuevatabla_</w:t>
+      </w:r>
+      <w:r>
+        <w:rPr>
+          <w:lang w:val="es-MX"/>
+        </w:rPr>
+        <w:t>tabla1</w:t>
+      </w:r>
       <w:r>
         <w:rPr>
           <w:lang w:val="es-MX"/>
@@ -150,447 +1175,16 @@
     </w:p>
     <w:p>
       <w:pPr>
-        <w:rPr>
-          <w:lang w:val="es-MX"/>
-        </w:rPr>
-      </w:pPr>
-      <w:r>
-        <w:rPr>
-          <w:lang w:val="es-MX"/>
-        </w:rPr>
-        <w:t>Objetivos:</w:t>
-      </w:r>
-    </w:p>
-    <w:p>
-      <w:pPr>
-        <w:rPr>
-          <w:lang w:val="es-MX"/>
-        </w:rPr>
-      </w:pPr>
-      <w:r>
-        <w:rPr>
-          <w:lang w:val="es-MX"/>
-        </w:rPr>
-        <w:t>&lt;&lt;</w:t>
-      </w:r>
-      <w:proofErr w:type="spellStart"/>
-      <w:r>
-        <w:rPr>
-          <w:lang w:val="es-MX"/>
-        </w:rPr>
-        <w:t>lista_de_objetivos</w:t>
-      </w:r>
-      <w:proofErr w:type="spellEnd"/>
-      <w:r>
-        <w:rPr>
-          <w:lang w:val="es-MX"/>
-        </w:rPr>
-        <w:t>&gt;&gt;</w:t>
-      </w:r>
-    </w:p>
-    <w:p>
-      <w:pPr>
-        <w:rPr>
-          <w:lang w:val="es-MX"/>
-        </w:rPr>
-      </w:pPr>
-    </w:p>
-    <w:p>
-      <w:pPr>
-        <w:rPr>
-          <w:lang w:val="es-MX"/>
-        </w:rPr>
-      </w:pPr>
-      <w:r>
-        <w:rPr>
-          <w:lang w:val="es-MX"/>
-        </w:rPr>
-        <w:t xml:space="preserve">Este párrafo ya existe en la plantilla y cita a la </w:t>
-      </w:r>
-      <w:r>
-        <w:rPr>
-          <w:lang w:val="es-MX"/>
-        </w:rPr>
-        <w:fldChar w:fldCharType="begin"/>
-      </w:r>
-      <w:r>
-        <w:rPr>
-          <w:lang w:val="es-MX"/>
-        </w:rPr>
-        <w:instrText xml:space="preserve"> REF _Ref231395923 \h </w:instrText>
-      </w:r>
-      <w:r>
-        <w:rPr>
-          <w:lang w:val="es-MX"/>
-        </w:rPr>
-      </w:r>
-      <w:r>
-        <w:rPr>
-          <w:lang w:val="es-MX"/>
-        </w:rPr>
-        <w:fldChar w:fldCharType="separate"/>
-      </w:r>
-      <w:r>
-        <w:t xml:space="preserve">Figura </w:t>
-      </w:r>
-      <w:r>
-        <w:rPr>
-          <w:noProof/>
-        </w:rPr>
-        <w:t>1</w:t>
-      </w:r>
-      <w:r>
-        <w:rPr>
-          <w:lang w:val="es-MX"/>
-        </w:rPr>
-        <w:fldChar w:fldCharType="end"/>
-      </w:r>
-    </w:p>
-    <w:p>
-      <w:pPr>
-        <w:rPr>
-          <w:lang w:val="es-MX"/>
-        </w:rPr>
-      </w:pPr>
-    </w:p>
-    <w:p>
-      <w:pPr>
-        <w:spacing w:line="240" w:lineRule="auto"/>
-        <w:jc w:val="center"/>
-        <w:rPr>
-          <w:lang w:val="es-MX"/>
-        </w:rPr>
-      </w:pPr>
-      <w:r>
-        <w:rPr>
-          <w:lang w:val="es-MX"/>
-        </w:rPr>
-        <w:t>&lt;&lt;</w:t>
-      </w:r>
-      <w:proofErr w:type="spellStart"/>
-      <w:r>
-        <w:rPr>
-          <w:lang w:val="es-MX"/>
-        </w:rPr>
-        <w:t>fig_sin_titulo</w:t>
-      </w:r>
-      <w:proofErr w:type="spellEnd"/>
-      <w:r>
-        <w:rPr>
-          <w:lang w:val="es-MX"/>
-        </w:rPr>
-        <w:t>&gt;&gt;</w:t>
-      </w:r>
-    </w:p>
-    <w:p>
-      <w:pPr>
-        <w:pStyle w:val="Carcentrado"/>
-        <w:rPr>
-          <w:lang w:val="es-MX"/>
-        </w:rPr>
-      </w:pPr>
-      <w:bookmarkStart w:id="0" w:name="_Ref231395923"/>
-      <w:r>
-        <w:t xml:space="preserve">Figura </w:t>
-      </w:r>
-      <w:fldSimple w:instr=" SEQ Figura \* ARABIC ">
-        <w:r>
-          <w:rPr>
-            <w:noProof/>
-          </w:rPr>
-          <w:t>1</w:t>
-        </w:r>
-      </w:fldSimple>
-      <w:bookmarkEnd w:id="0"/>
-      <w:r>
-        <w:t xml:space="preserve"> Este título también tiene la fecha como variable. Hoy es </w:t>
-      </w:r>
-      <w:r>
-        <w:rPr>
-          <w:lang w:val="es-MX"/>
-        </w:rPr>
-        <w:t>&lt;&lt;fecha&gt;&gt;.</w:t>
-      </w:r>
-    </w:p>
-    <w:p>
-      <w:pPr>
-        <w:rPr>
-          <w:lang w:val="es-MX"/>
-        </w:rPr>
-      </w:pPr>
-    </w:p>
-    <w:p>
-      <w:pPr>
-        <w:rPr>
-          <w:lang w:val="es-MX"/>
-        </w:rPr>
-      </w:pPr>
-      <w:r>
-        <w:rPr>
-          <w:lang w:val="es-MX"/>
-        </w:rPr>
-        <w:t>Ahora sigue insertar la &lt;&lt;</w:t>
-      </w:r>
-      <w:proofErr w:type="spellStart"/>
-      <w:r>
-        <w:rPr>
-          <w:lang w:val="es-MX"/>
-        </w:rPr>
-        <w:t>reffigura_con_titulo</w:t>
-      </w:r>
-      <w:proofErr w:type="spellEnd"/>
-      <w:r>
-        <w:rPr>
-          <w:lang w:val="es-MX"/>
-        </w:rPr>
-        <w:t>&gt;&gt; la cual genera su título por el código.</w:t>
-      </w:r>
-    </w:p>
-    <w:p>
-      <w:pPr>
-        <w:spacing w:line="240" w:lineRule="auto"/>
-        <w:jc w:val="center"/>
-        <w:rPr>
-          <w:lang w:val="es-MX"/>
-        </w:rPr>
-      </w:pPr>
-      <w:r>
-        <w:rPr>
-          <w:lang w:val="es-MX"/>
-        </w:rPr>
-        <w:t>&lt;&lt;</w:t>
-      </w:r>
-      <w:proofErr w:type="spellStart"/>
-      <w:r>
-        <w:rPr>
-          <w:lang w:val="es-MX"/>
-        </w:rPr>
-        <w:t>fig_con_titulo</w:t>
-      </w:r>
-      <w:proofErr w:type="spellEnd"/>
-      <w:r>
-        <w:rPr>
-          <w:lang w:val="es-MX"/>
-        </w:rPr>
-        <w:t>&gt;&gt;</w:t>
-      </w:r>
-    </w:p>
-    <w:p>
-      <w:pPr>
-        <w:spacing w:line="240" w:lineRule="auto"/>
-        <w:rPr>
-          <w:u w:val="single"/>
-          <w:lang w:val="es-MX"/>
-        </w:rPr>
-      </w:pPr>
-      <w:r>
-        <w:rPr>
-          <w:lang w:val="es-MX"/>
-        </w:rPr>
-        <w:t xml:space="preserve">Recuerda que la </w:t>
-      </w:r>
-      <w:proofErr w:type="spellStart"/>
-      <w:r>
-        <w:rPr>
-          <w:lang w:val="es-MX"/>
-        </w:rPr>
-        <w:t>la</w:t>
-      </w:r>
-      <w:proofErr w:type="spellEnd"/>
-      <w:r>
-        <w:rPr>
-          <w:lang w:val="es-MX"/>
-        </w:rPr>
-        <w:t xml:space="preserve"> variable que lleva la figura debe tener el “mismo” nombre que la referencia. El iniciador de la figura es </w:t>
-      </w:r>
-      <w:r>
-        <w:rPr>
-          <w:lang w:val="es-MX"/>
-        </w:rPr>
-        <w:t>&lt;&lt;</w:t>
-      </w:r>
-      <w:proofErr w:type="spellStart"/>
-      <w:r>
-        <w:rPr>
-          <w:lang w:val="es-MX"/>
-        </w:rPr>
-        <w:t>fig</w:t>
-      </w:r>
-      <w:proofErr w:type="spellEnd"/>
-      <w:r>
-        <w:rPr>
-          <w:lang w:val="es-MX"/>
-        </w:rPr>
-        <w:t xml:space="preserve">_ y </w:t>
-      </w:r>
-      <w:proofErr w:type="spellStart"/>
-      <w:r>
-        <w:rPr>
-          <w:lang w:val="es-MX"/>
-        </w:rPr>
-        <w:t>lueg</w:t>
-      </w:r>
-      <w:proofErr w:type="spellEnd"/>
-      <w:r>
-        <w:rPr>
-          <w:lang w:val="es-MX"/>
-        </w:rPr>
-        <w:t xml:space="preserve"> sigue “</w:t>
-      </w:r>
-      <w:proofErr w:type="spellStart"/>
-      <w:r>
-        <w:rPr>
-          <w:lang w:val="es-MX"/>
-        </w:rPr>
-        <w:t>nombredelafigura</w:t>
-      </w:r>
-      <w:proofErr w:type="spellEnd"/>
-      <w:r>
-        <w:rPr>
-          <w:lang w:val="es-MX"/>
-        </w:rPr>
-        <w:t xml:space="preserve">”, ese mismo nombre considerando mayúsculas y minúsculas debe estar en la referencia; pero la referencia inicia con </w:t>
-      </w:r>
-      <w:r>
-        <w:rPr>
-          <w:lang w:val="es-MX"/>
-        </w:rPr>
-        <w:t>&lt;</w:t>
-      </w:r>
-      <w:r>
-        <w:rPr>
-          <w:lang w:val="es-MX"/>
-        </w:rPr>
-        <w:t>&lt;</w:t>
-      </w:r>
-      <w:proofErr w:type="spellStart"/>
-      <w:r>
-        <w:rPr>
-          <w:lang w:val="es-MX"/>
-        </w:rPr>
-        <w:t>reffigura</w:t>
-      </w:r>
-      <w:proofErr w:type="spellEnd"/>
-      <w:r>
-        <w:rPr>
-          <w:lang w:val="es-MX"/>
-        </w:rPr>
-        <w:t>_ luego sigue “</w:t>
-      </w:r>
-      <w:proofErr w:type="spellStart"/>
-      <w:r>
-        <w:rPr>
-          <w:lang w:val="es-MX"/>
-        </w:rPr>
-        <w:t>nombredelafigura</w:t>
-      </w:r>
-      <w:proofErr w:type="spellEnd"/>
-      <w:r>
-        <w:rPr>
-          <w:lang w:val="es-MX"/>
-        </w:rPr>
-        <w:t>”.</w:t>
-      </w:r>
-      <w:r>
-        <w:rPr>
-          <w:lang w:val="es-MX"/>
-        </w:rPr>
-        <w:t xml:space="preserve"> Puedes ver a lo que me refiero con esta referencia </w:t>
-      </w:r>
-      <w:r>
-        <w:rPr>
-          <w:lang w:val="es-MX"/>
-        </w:rPr>
-        <w:t>&lt;&lt;</w:t>
-      </w:r>
-      <w:proofErr w:type="spellStart"/>
-      <w:r>
-        <w:rPr>
-          <w:lang w:val="es-MX"/>
-        </w:rPr>
-        <w:t>reffigura_con_titulo</w:t>
-      </w:r>
-      <w:proofErr w:type="spellEnd"/>
-      <w:r>
-        <w:rPr>
-          <w:lang w:val="es-MX"/>
-        </w:rPr>
-        <w:t>&gt;&gt;</w:t>
-      </w:r>
-      <w:r>
-        <w:rPr>
-          <w:lang w:val="es-MX"/>
-        </w:rPr>
-        <w:t>.</w:t>
-      </w:r>
-    </w:p>
-    <w:p>
-      <w:pPr>
-        <w:spacing w:line="240" w:lineRule="auto"/>
-        <w:rPr>
-          <w:lang w:val="es-MX"/>
-        </w:rPr>
-      </w:pPr>
-    </w:p>
-    <w:p>
-      <w:pPr>
-        <w:spacing w:line="240" w:lineRule="auto"/>
-        <w:rPr>
-          <w:lang w:val="es-MX"/>
-        </w:rPr>
-      </w:pPr>
-    </w:p>
-    <w:p>
-      <w:pPr>
-        <w:spacing w:line="240" w:lineRule="auto"/>
-        <w:rPr>
-          <w:lang w:val="es-MX"/>
-        </w:rPr>
-      </w:pPr>
-      <w:r>
-        <w:rPr>
-          <w:lang w:val="es-MX"/>
-        </w:rPr>
-        <w:t>Ahora inserto una tabla con su referencia &lt;&lt;reftabla_tabla1&gt;&gt;</w:t>
-      </w:r>
-    </w:p>
-    <w:p>
-      <w:pPr>
-        <w:spacing w:line="240" w:lineRule="auto"/>
-        <w:rPr>
-          <w:lang w:val="es-MX"/>
-        </w:rPr>
-      </w:pPr>
-    </w:p>
-    <w:p>
-      <w:pPr>
-        <w:rPr>
-          <w:lang w:val="es-MX"/>
-        </w:rPr>
-      </w:pPr>
-      <w:r>
-        <w:rPr>
-          <w:lang w:val="es-MX"/>
-        </w:rPr>
-        <w:t>&lt;&lt;</w:t>
-      </w:r>
-      <w:r>
-        <w:rPr>
-          <w:lang w:val="es-MX"/>
-        </w:rPr>
-        <w:t>nuevatabla_</w:t>
-      </w:r>
-      <w:r>
-        <w:rPr>
-          <w:lang w:val="es-MX"/>
-        </w:rPr>
-        <w:t>tabla1</w:t>
-      </w:r>
-      <w:r>
-        <w:rPr>
-          <w:lang w:val="es-MX"/>
-        </w:rPr>
-        <w:t>&gt;&gt;</w:t>
+        <w:pStyle w:val="Ttulo1"/>
+        <w:rPr>
+          <w:lang w:val="es-MX"/>
+        </w:rPr>
+      </w:pPr>
+      <w:r>
+        <w:rPr>
+          <w:lang w:val="es-MX"/>
+        </w:rPr>
+        <w:t>Ejemplo 9: Agregar toda una sección.</w:t>
       </w:r>
     </w:p>
     <w:p>
@@ -919,8 +1513,125 @@
       </w:pPr>
     </w:lvl>
   </w:abstractNum>
+  <w:abstractNum w:abstractNumId="1" w15:restartNumberingAfterBreak="0">
+    <w:nsid w:val="5449339A"/>
+    <w:multiLevelType w:val="hybridMultilevel"/>
+    <w:tmpl w:val="8C1A2C12"/>
+    <w:lvl w:ilvl="0" w:tplc="D94498E2">
+      <w:start w:val="1"/>
+      <w:numFmt w:val="bullet"/>
+      <w:pStyle w:val="listanonumerada"/>
+      <w:lvlText w:val=""/>
+      <w:lvlJc w:val="left"/>
+      <w:pPr>
+        <w:ind w:left="1145" w:hanging="360"/>
+      </w:pPr>
+      <w:rPr>
+        <w:rFonts w:ascii="Symbol" w:hAnsi="Symbol" w:hint="default"/>
+      </w:rPr>
+    </w:lvl>
+    <w:lvl w:ilvl="1" w:tplc="080A0003" w:tentative="1">
+      <w:start w:val="1"/>
+      <w:numFmt w:val="bullet"/>
+      <w:lvlText w:val="o"/>
+      <w:lvlJc w:val="left"/>
+      <w:pPr>
+        <w:ind w:left="1865" w:hanging="360"/>
+      </w:pPr>
+      <w:rPr>
+        <w:rFonts w:ascii="Courier New" w:hAnsi="Courier New" w:cs="Courier New" w:hint="default"/>
+      </w:rPr>
+    </w:lvl>
+    <w:lvl w:ilvl="2" w:tplc="080A0005" w:tentative="1">
+      <w:start w:val="1"/>
+      <w:numFmt w:val="bullet"/>
+      <w:lvlText w:val=""/>
+      <w:lvlJc w:val="left"/>
+      <w:pPr>
+        <w:ind w:left="2585" w:hanging="360"/>
+      </w:pPr>
+      <w:rPr>
+        <w:rFonts w:ascii="Wingdings" w:hAnsi="Wingdings" w:hint="default"/>
+      </w:rPr>
+    </w:lvl>
+    <w:lvl w:ilvl="3" w:tplc="080A0001" w:tentative="1">
+      <w:start w:val="1"/>
+      <w:numFmt w:val="bullet"/>
+      <w:lvlText w:val=""/>
+      <w:lvlJc w:val="left"/>
+      <w:pPr>
+        <w:ind w:left="3305" w:hanging="360"/>
+      </w:pPr>
+      <w:rPr>
+        <w:rFonts w:ascii="Symbol" w:hAnsi="Symbol" w:hint="default"/>
+      </w:rPr>
+    </w:lvl>
+    <w:lvl w:ilvl="4" w:tplc="080A0003" w:tentative="1">
+      <w:start w:val="1"/>
+      <w:numFmt w:val="bullet"/>
+      <w:lvlText w:val="o"/>
+      <w:lvlJc w:val="left"/>
+      <w:pPr>
+        <w:ind w:left="4025" w:hanging="360"/>
+      </w:pPr>
+      <w:rPr>
+        <w:rFonts w:ascii="Courier New" w:hAnsi="Courier New" w:cs="Courier New" w:hint="default"/>
+      </w:rPr>
+    </w:lvl>
+    <w:lvl w:ilvl="5" w:tplc="080A0005" w:tentative="1">
+      <w:start w:val="1"/>
+      <w:numFmt w:val="bullet"/>
+      <w:lvlText w:val=""/>
+      <w:lvlJc w:val="left"/>
+      <w:pPr>
+        <w:ind w:left="4745" w:hanging="360"/>
+      </w:pPr>
+      <w:rPr>
+        <w:rFonts w:ascii="Wingdings" w:hAnsi="Wingdings" w:hint="default"/>
+      </w:rPr>
+    </w:lvl>
+    <w:lvl w:ilvl="6" w:tplc="080A0001" w:tentative="1">
+      <w:start w:val="1"/>
+      <w:numFmt w:val="bullet"/>
+      <w:lvlText w:val=""/>
+      <w:lvlJc w:val="left"/>
+      <w:pPr>
+        <w:ind w:left="5465" w:hanging="360"/>
+      </w:pPr>
+      <w:rPr>
+        <w:rFonts w:ascii="Symbol" w:hAnsi="Symbol" w:hint="default"/>
+      </w:rPr>
+    </w:lvl>
+    <w:lvl w:ilvl="7" w:tplc="080A0003" w:tentative="1">
+      <w:start w:val="1"/>
+      <w:numFmt w:val="bullet"/>
+      <w:lvlText w:val="o"/>
+      <w:lvlJc w:val="left"/>
+      <w:pPr>
+        <w:ind w:left="6185" w:hanging="360"/>
+      </w:pPr>
+      <w:rPr>
+        <w:rFonts w:ascii="Courier New" w:hAnsi="Courier New" w:cs="Courier New" w:hint="default"/>
+      </w:rPr>
+    </w:lvl>
+    <w:lvl w:ilvl="8" w:tplc="080A0005" w:tentative="1">
+      <w:start w:val="1"/>
+      <w:numFmt w:val="bullet"/>
+      <w:lvlText w:val=""/>
+      <w:lvlJc w:val="left"/>
+      <w:pPr>
+        <w:ind w:left="6905" w:hanging="360"/>
+      </w:pPr>
+      <w:rPr>
+        <w:rFonts w:ascii="Wingdings" w:hAnsi="Wingdings" w:hint="default"/>
+      </w:rPr>
+    </w:lvl>
+  </w:abstractNum>
   <w:num w:numId="1" w16cid:durableId="715399435">
     <w:abstractNumId w:val="0"/>
+  </w:num>
+  <w:num w:numId="2" w16cid:durableId="1582252294">
+    <w:abstractNumId w:val="1"/>
   </w:num>
 </w:numbering>
 </file>
@@ -1323,22 +2034,31 @@
   <w:style w:type="paragraph" w:default="1" w:styleId="Normal">
     <w:name w:val="Normal"/>
     <w:qFormat/>
-    <w:rsid w:val="00A652B7"/>
+    <w:rsid w:val="00853C36"/>
+    <w:pPr>
+      <w:spacing w:line="360" w:lineRule="auto"/>
+      <w:ind w:firstLine="425"/>
+      <w:jc w:val="both"/>
+    </w:pPr>
   </w:style>
   <w:style w:type="paragraph" w:styleId="Ttulo1">
     <w:name w:val="heading 1"/>
     <w:basedOn w:val="Normal"/>
     <w:next w:val="Normal"/>
+    <w:link w:val="Ttulo1Car"/>
     <w:uiPriority w:val="9"/>
     <w:qFormat/>
+    <w:rsid w:val="00853C36"/>
     <w:pPr>
       <w:keepNext/>
       <w:keepLines/>
       <w:spacing w:before="400" w:after="120"/>
+      <w:ind w:firstLine="0"/>
       <w:outlineLvl w:val="0"/>
     </w:pPr>
     <w:rPr>
-      <w:sz w:val="40"/>
+      <w:b/>
+      <w:sz w:val="28"/>
       <w:szCs w:val="40"/>
     </w:rPr>
   </w:style>
@@ -1442,7 +2162,6 @@
   <w:style w:type="character" w:default="1" w:styleId="Fuentedeprrafopredeter">
     <w:name w:val="Default Paragraph Font"/>
     <w:uiPriority w:val="1"/>
-    <w:semiHidden/>
     <w:unhideWhenUsed/>
   </w:style>
   <w:style w:type="table" w:default="1" w:styleId="Tablanormal">
@@ -1516,10 +2235,6 @@
     <w:link w:val="subtituloCar"/>
     <w:qFormat/>
     <w:rsid w:val="00985465"/>
-    <w:pPr>
-      <w:spacing w:line="360" w:lineRule="auto"/>
-      <w:ind w:firstLine="425"/>
-    </w:pPr>
     <w:rPr>
       <w:b/>
       <w:color w:val="000000" w:themeColor="text1"/>
@@ -1559,17 +2274,24 @@
     <w:basedOn w:val="Normal"/>
     <w:link w:val="CarcentradoCar"/>
     <w:qFormat/>
-    <w:rsid w:val="0092048E"/>
+    <w:rsid w:val="0073422F"/>
     <w:pPr>
       <w:spacing w:line="240" w:lineRule="auto"/>
+      <w:ind w:firstLine="0"/>
       <w:jc w:val="center"/>
     </w:pPr>
+    <w:rPr>
+      <w:sz w:val="18"/>
+    </w:rPr>
   </w:style>
   <w:style w:type="character" w:customStyle="1" w:styleId="CarcentradoCar">
     <w:name w:val="Car_centrado Car"/>
     <w:basedOn w:val="Fuentedeprrafopredeter"/>
     <w:link w:val="Carcentrado"/>
-    <w:rsid w:val="0092048E"/>
+    <w:rsid w:val="0073422F"/>
+    <w:rPr>
+      <w:sz w:val="18"/>
+    </w:rPr>
   </w:style>
   <w:style w:type="paragraph" w:styleId="Descripcin">
     <w:name w:val="caption"/>
@@ -1596,9 +2318,6 @@
     <w:link w:val="NegritasCar"/>
     <w:qFormat/>
     <w:rsid w:val="005231AA"/>
-    <w:pPr>
-      <w:jc w:val="both"/>
-    </w:pPr>
     <w:rPr>
       <w:b/>
       <w:lang w:val="es-MX"/>
@@ -1611,6 +2330,87 @@
     <w:rsid w:val="005231AA"/>
     <w:rPr>
       <w:b/>
+      <w:lang w:val="es-MX"/>
+    </w:rPr>
+  </w:style>
+  <w:style w:type="character" w:customStyle="1" w:styleId="Ttulo1Car">
+    <w:name w:val="Título 1 Car"/>
+    <w:basedOn w:val="Fuentedeprrafopredeter"/>
+    <w:link w:val="Ttulo1"/>
+    <w:uiPriority w:val="9"/>
+    <w:rsid w:val="00853C36"/>
+    <w:rPr>
+      <w:b/>
+      <w:sz w:val="28"/>
+      <w:szCs w:val="40"/>
+    </w:rPr>
+  </w:style>
+  <w:style w:type="paragraph" w:customStyle="1" w:styleId="Normalsinsangria">
+    <w:name w:val="Normal_sin_sangria"/>
+    <w:basedOn w:val="Normal"/>
+    <w:link w:val="NormalsinsangriaCar"/>
+    <w:qFormat/>
+    <w:rsid w:val="00BB0A55"/>
+    <w:pPr>
+      <w:ind w:firstLine="0"/>
+    </w:pPr>
+    <w:rPr>
+      <w:lang w:val="es-MX"/>
+    </w:rPr>
+  </w:style>
+  <w:style w:type="character" w:customStyle="1" w:styleId="NormalsinsangriaCar">
+    <w:name w:val="Normal_sin_sangria Car"/>
+    <w:basedOn w:val="Fuentedeprrafopredeter"/>
+    <w:link w:val="Normalsinsangria"/>
+    <w:rsid w:val="00BB0A55"/>
+    <w:rPr>
+      <w:lang w:val="es-MX"/>
+    </w:rPr>
+  </w:style>
+  <w:style w:type="paragraph" w:customStyle="1" w:styleId="listanonumerada">
+    <w:name w:val="lista_no_numerada"/>
+    <w:basedOn w:val="Normal"/>
+    <w:link w:val="listanonumeradaCar"/>
+    <w:qFormat/>
+    <w:rsid w:val="00754C85"/>
+    <w:pPr>
+      <w:numPr>
+        <w:numId w:val="2"/>
+      </w:numPr>
+    </w:pPr>
+    <w:rPr>
+      <w:lang w:val="es-MX"/>
+    </w:rPr>
+  </w:style>
+  <w:style w:type="character" w:customStyle="1" w:styleId="listanonumeradaCar">
+    <w:name w:val="lista_no_numerada Car"/>
+    <w:basedOn w:val="Fuentedeprrafopredeter"/>
+    <w:link w:val="listanonumerada"/>
+    <w:rsid w:val="00754C85"/>
+    <w:rPr>
+      <w:lang w:val="es-MX"/>
+    </w:rPr>
+  </w:style>
+  <w:style w:type="paragraph" w:customStyle="1" w:styleId="Carjustificado">
+    <w:name w:val="Car_justificado"/>
+    <w:basedOn w:val="Carcentrado"/>
+    <w:link w:val="CarjustificadoCar"/>
+    <w:qFormat/>
+    <w:rsid w:val="008C0840"/>
+    <w:pPr>
+      <w:jc w:val="both"/>
+    </w:pPr>
+    <w:rPr>
+      <w:lang w:val="es-MX"/>
+    </w:rPr>
+  </w:style>
+  <w:style w:type="character" w:customStyle="1" w:styleId="CarjustificadoCar">
+    <w:name w:val="Car_justificado Car"/>
+    <w:basedOn w:val="CarcentradoCar"/>
+    <w:link w:val="Carjustificado"/>
+    <w:rsid w:val="008C0840"/>
+    <w:rPr>
+      <w:sz w:val="18"/>
       <w:lang w:val="es-MX"/>
     </w:rPr>
   </w:style>

</xml_diff>

<commit_message>
Fix: Parte 2 del ajuste de bugs y de generación de documento de ejemplo; mejora
</commit_message>
<xml_diff>
--- a/tests/demo.docx
+++ b/tests/demo.docx
@@ -1443,157 +1443,11 @@
     <w:p>
       <w:pPr>
         <w:pStyle w:val="Normal"/>
-        <w:rPr>
-          <w:lang w:val="es-MX"/>
-        </w:rPr>
-      </w:pPr>
-      <w:r>
-        <w:rPr/>
-        <w:t xml:space="preserve">Ahora, probaremos textos con estilos insertados. El día de </w:t>
-      </w:r>
-      <w:r>
-        <w:rPr>
-          <w:lang w:val="es-MX"/>
-        </w:rPr>
-        <w:t xml:space="preserve">&lt;&lt;fecha&gt;&gt; tengo ganas de poner unas letras en </w:t>
-      </w:r>
-      <w:r>
-        <w:rPr>
-          <w:b/>
-          <w:bCs/>
-          <w:lang w:val="es-MX"/>
-        </w:rPr>
-        <w:t>negrita</w:t>
-      </w:r>
-      <w:r>
-        <w:rPr>
-          <w:lang w:val="es-MX"/>
-        </w:rPr>
-        <w:t xml:space="preserve"> y otras en </w:t>
-      </w:r>
-      <w:r>
-        <w:rPr>
-          <w:i/>
-          <w:iCs/>
-          <w:lang w:val="es-MX"/>
-        </w:rPr>
-        <w:t>cursiva</w:t>
-      </w:r>
-      <w:r>
-        <w:rPr>
-          <w:lang w:val="es-MX"/>
-        </w:rPr>
-        <w:t>. El texto en negrita y cursiva debe mantenerse sin cambios de estilo.</w:t>
-      </w:r>
-    </w:p>
-    <w:p>
-      <w:pPr>
-        <w:pStyle w:val="Normal"/>
-        <w:rPr>
-          <w:lang w:val="es-MX"/>
-        </w:rPr>
-      </w:pPr>
-      <w:r>
-        <w:rPr>
-          <w:lang w:val="es-MX"/>
-        </w:rPr>
-      </w:r>
-    </w:p>
-    <w:p>
-      <w:pPr>
-        <w:pStyle w:val="Normal"/>
-        <w:rPr>
-          <w:lang w:val="es-MX"/>
-        </w:rPr>
-      </w:pPr>
-      <w:r>
-        <w:rPr>
-          <w:lang w:val="es-MX"/>
-        </w:rPr>
-        <w:t xml:space="preserve">A continuación, se prueba que al insertar varias variables se mantengan las referencias cruzadas (ver más en </w:t>
-      </w:r>
-      <w:r>
-        <w:rPr>
-          <w:lang w:val="es-MX"/>
-        </w:rPr>
-        <w:fldChar w:fldCharType="begin"/>
-      </w:r>
-      <w:r>
-        <w:rPr>
-          <w:lang w:val="es-MX"/>
-        </w:rPr>
-        <w:instrText xml:space="preserve"> REF _Ref241232871 \h </w:instrText>
-      </w:r>
-      <w:r>
-        <w:rPr>
-          <w:lang w:val="es-MX"/>
-        </w:rPr>
-        <w:fldChar w:fldCharType="separate"/>
-      </w:r>
-      <w:r>
-        <w:rPr>
-          <w:lang w:val="es-MX"/>
-        </w:rPr>
-        <w:t>Título de sección</w:t>
-      </w:r>
-      <w:r>
-        <w:rPr>
-          <w:lang w:val="es-MX"/>
-        </w:rPr>
-        <w:fldChar w:fldCharType="end"/>
-      </w:r>
-      <w:r>
-        <w:rPr>
-          <w:lang w:val="es-MX"/>
-        </w:rPr>
-        <w:t>). En día &lt;&lt;fecha&gt;&gt; se observó que el &lt;&lt;anio&gt;&gt; fue muy caluroso.</w:t>
-      </w:r>
-    </w:p>
-    <w:p>
-      <w:pPr>
-        <w:pStyle w:val="Normal"/>
-        <w:rPr>
-          <w:lang w:val="es-MX"/>
-        </w:rPr>
-      </w:pPr>
-      <w:r>
-        <w:rPr>
-          <w:lang w:val="es-MX"/>
-        </w:rPr>
-      </w:r>
-    </w:p>
-    <w:p>
-      <w:pPr>
-        <w:pStyle w:val="Heading1"/>
-        <w:numPr>
-          <w:ilvl w:val="0"/>
-          <w:numId w:val="2"/>
-        </w:numPr>
-        <w:rPr>
-          <w:lang w:val="es-MX"/>
-        </w:rPr>
-      </w:pPr>
-      <w:bookmarkStart w:id="2" w:name="_Ref241232871"/>
-      <w:r>
-        <w:rPr>
-          <w:lang w:val="es-MX"/>
-        </w:rPr>
-        <w:t>Título de sección</w:t>
-      </w:r>
-      <w:bookmarkEnd w:id="2"/>
-    </w:p>
-    <w:p>
-      <w:pPr>
-        <w:pStyle w:val="Normal"/>
-        <w:rPr>
-          <w:lang w:val="es-MX"/>
-        </w:rPr>
-      </w:pPr>
-      <w:r>
-        <w:rPr>
-          <w:lang w:val="es-MX"/>
-        </w:rPr>
-        <w:t>Esta es una sección de prueba con un título</w:t>
+        <w:ind w:hanging="0" w:start="0"/>
+        <w:rPr/>
+      </w:pPr>
+      <w:r>
+        <w:rPr/>
       </w:r>
     </w:p>
     <w:sectPr>
@@ -1733,125 +1587,6 @@
   <w:abstractNum w:abstractNumId="2">
     <w:lvl w:ilvl="0">
       <w:start w:val="1"/>
-      <w:numFmt w:val="decimal"/>
-      <w:lvlText w:val="%1."/>
-      <w:lvlJc w:val="start"/>
-      <w:pPr>
-        <w:tabs>
-          <w:tab w:val="num" w:pos="0"/>
-        </w:tabs>
-        <w:ind w:start="720" w:hanging="360"/>
-      </w:pPr>
-      <w:rPr/>
-    </w:lvl>
-    <w:lvl w:ilvl="1">
-      <w:start w:val="1"/>
-      <w:numFmt w:val="lowerLetter"/>
-      <w:lvlText w:val="%2."/>
-      <w:lvlJc w:val="start"/>
-      <w:pPr>
-        <w:tabs>
-          <w:tab w:val="num" w:pos="0"/>
-        </w:tabs>
-        <w:ind w:start="1440" w:hanging="360"/>
-      </w:pPr>
-      <w:rPr/>
-    </w:lvl>
-    <w:lvl w:ilvl="2">
-      <w:start w:val="1"/>
-      <w:numFmt w:val="lowerRoman"/>
-      <w:lvlText w:val="%3."/>
-      <w:lvlJc w:val="end"/>
-      <w:pPr>
-        <w:tabs>
-          <w:tab w:val="num" w:pos="0"/>
-        </w:tabs>
-        <w:ind w:start="2160" w:hanging="180"/>
-      </w:pPr>
-      <w:rPr/>
-    </w:lvl>
-    <w:lvl w:ilvl="3">
-      <w:start w:val="1"/>
-      <w:numFmt w:val="decimal"/>
-      <w:lvlText w:val="%4."/>
-      <w:lvlJc w:val="start"/>
-      <w:pPr>
-        <w:tabs>
-          <w:tab w:val="num" w:pos="0"/>
-        </w:tabs>
-        <w:ind w:start="2880" w:hanging="360"/>
-      </w:pPr>
-      <w:rPr/>
-    </w:lvl>
-    <w:lvl w:ilvl="4">
-      <w:start w:val="1"/>
-      <w:numFmt w:val="lowerLetter"/>
-      <w:lvlText w:val="%5."/>
-      <w:lvlJc w:val="start"/>
-      <w:pPr>
-        <w:tabs>
-          <w:tab w:val="num" w:pos="0"/>
-        </w:tabs>
-        <w:ind w:start="3600" w:hanging="360"/>
-      </w:pPr>
-      <w:rPr/>
-    </w:lvl>
-    <w:lvl w:ilvl="5">
-      <w:start w:val="1"/>
-      <w:numFmt w:val="lowerRoman"/>
-      <w:lvlText w:val="%6."/>
-      <w:lvlJc w:val="end"/>
-      <w:pPr>
-        <w:tabs>
-          <w:tab w:val="num" w:pos="0"/>
-        </w:tabs>
-        <w:ind w:start="4320" w:hanging="180"/>
-      </w:pPr>
-      <w:rPr/>
-    </w:lvl>
-    <w:lvl w:ilvl="6">
-      <w:start w:val="1"/>
-      <w:numFmt w:val="decimal"/>
-      <w:lvlText w:val="%7."/>
-      <w:lvlJc w:val="start"/>
-      <w:pPr>
-        <w:tabs>
-          <w:tab w:val="num" w:pos="0"/>
-        </w:tabs>
-        <w:ind w:start="5040" w:hanging="360"/>
-      </w:pPr>
-      <w:rPr/>
-    </w:lvl>
-    <w:lvl w:ilvl="7">
-      <w:start w:val="1"/>
-      <w:numFmt w:val="lowerLetter"/>
-      <w:lvlText w:val="%8."/>
-      <w:lvlJc w:val="start"/>
-      <w:pPr>
-        <w:tabs>
-          <w:tab w:val="num" w:pos="0"/>
-        </w:tabs>
-        <w:ind w:start="5760" w:hanging="360"/>
-      </w:pPr>
-      <w:rPr/>
-    </w:lvl>
-    <w:lvl w:ilvl="8">
-      <w:start w:val="1"/>
-      <w:numFmt w:val="lowerRoman"/>
-      <w:lvlText w:val="%9."/>
-      <w:lvlJc w:val="end"/>
-      <w:pPr>
-        <w:tabs>
-          <w:tab w:val="num" w:pos="0"/>
-        </w:tabs>
-        <w:ind w:start="6480" w:hanging="180"/>
-      </w:pPr>
-      <w:rPr/>
-    </w:lvl>
-  </w:abstractNum>
-  <w:abstractNum w:abstractNumId="3">
-    <w:lvl w:ilvl="0">
-      <w:start w:val="1"/>
       <w:numFmt w:val="bullet"/>
       <w:lvlText w:val=""/>
       <w:lvlJc w:val="start"/>
@@ -1991,9 +1726,6 @@
   </w:num>
   <w:num w:numId="2">
     <w:abstractNumId w:val="2"/>
-  </w:num>
-  <w:num w:numId="3">
-    <w:abstractNumId w:val="3"/>
   </w:num>
 </w:numbering>
 </file>
@@ -2784,7 +2516,7 @@
     <w:pPr>
       <w:numPr>
         <w:ilvl w:val="0"/>
-        <w:numId w:val="3"/>
+        <w:numId w:val="2"/>
       </w:numPr>
     </w:pPr>
     <w:rPr>

</xml_diff>

<commit_message>
Fix: Se agregan todas las pruebas necesarias y la demo de uso de la librería. Pendiente: Actualizar el archivo readme.md
</commit_message>
<xml_diff>
--- a/tests/demo.docx
+++ b/tests/demo.docx
@@ -10,7 +10,7 @@
       </w:pPr>
       <w:r>
         <w:rPr/>
-        <w:t>Ejemplo 1: Reemplazo de 1 variable en párrafos</w:t>
+        <w:t>Ejemplo 1: Reemplazo de 1 variable en párrafos.</w:t>
       </w:r>
     </w:p>
     <w:p>
@@ -96,7 +96,7 @@
       </w:r>
       <w:r>
         <w:rPr/>
-        <w:t>Ejemplo 7: Rellenar tabla existente</w:t>
+        <w:t>Ejemplo 8: Rellenar tabla existente.</w:t>
       </w:r>
       <w:r>
         <w:rPr/>
@@ -104,32 +104,139 @@
       </w:r>
       <w:r>
         <w:rPr/>
-        <w:t xml:space="preserve">. </w:t>
-      </w:r>
-      <w:r>
-        <w:rPr/>
-        <w:t xml:space="preserve">Esta librería fue publicada por </w:t>
-      </w:r>
-      <w:r>
-        <w:rPr/>
-        <w:t xml:space="preserve">el Dr. </w:t>
-      </w:r>
-      <w:r>
-        <w:rPr/>
-        <w:t xml:space="preserve">Fernando Bello Fuentes; conocido en la programacion como </w:t>
-      </w:r>
-      <w:r>
-        <w:rPr>
-          <w:lang w:val="es-MX"/>
-        </w:rPr>
-        <w:t xml:space="preserve">&lt;&lt;nombre_del_programador&gt;&gt; </w:t>
-      </w:r>
-      <w:r>
-        <w:rPr>
-          <w:lang w:val="es-MX"/>
-        </w:rPr>
-        <w:t>o en el mundo de las ciencias como F. Bello-Fuentes</w:t>
-      </w:r>
+        <w:t xml:space="preserve">. Esta librería fue publicada por el Dr. Fernando Bello Fuentes; conocido en la programacion como </w:t>
+      </w:r>
+      <w:r>
+        <w:rPr>
+          <w:lang w:val="es-MX"/>
+        </w:rPr>
+        <w:t>&lt;&lt;nombre_del_programador&gt;&gt; o en el mundo de las ciencias como F. Bello-Fuentes.</w:t>
+      </w:r>
+    </w:p>
+    <w:p>
+      <w:pPr>
+        <w:pStyle w:val="Normal"/>
+        <w:jc w:val="end"/>
+        <w:rPr/>
+      </w:pPr>
+      <w:r>
+        <w:rPr/>
+      </w:r>
+    </w:p>
+    <w:p>
+      <w:pPr>
+        <w:pStyle w:val="Heading1"/>
+        <w:rPr/>
+      </w:pPr>
+      <w:r>
+        <w:rPr/>
+        <w:t xml:space="preserve">Ejemplo 3: Reemplazar una variable por todo un párrafo y asignarle un estilo a dicho párrafo. </w:t>
+      </w:r>
+    </w:p>
+    <w:p>
+      <w:pPr>
+        <w:pStyle w:val="Normal1"/>
+        <w:rPr/>
+      </w:pPr>
+      <w:r>
+        <w:rPr>
+          <w:lang w:val="es-MX"/>
+        </w:rPr>
+        <w:t>En este ejemplo, haremos algo más interesante. Vamos a reemplazar la variable de “párrafos_previos” por tres párrafos escritos directamente desde el código, donde se usarán las variables “fecha” y “nombre_del_programador”; incluso, pondremos la separación entre ellos.</w:t>
+      </w:r>
+    </w:p>
+    <w:p>
+      <w:pPr>
+        <w:pStyle w:val="Normal"/>
+        <w:rPr>
+          <w:lang w:val="es-MX"/>
+        </w:rPr>
+      </w:pPr>
+      <w:r>
+        <w:rPr>
+          <w:lang w:val="es-MX"/>
+        </w:rPr>
+      </w:r>
+    </w:p>
+    <w:p>
+      <w:pPr>
+        <w:pStyle w:val="Normalsinsangria"/>
+        <w:rPr/>
+      </w:pPr>
+      <w:r>
+        <w:rPr/>
+        <w:t>&lt;&lt;parrafos_previos&gt;&gt;</w:t>
+      </w:r>
+    </w:p>
+    <w:p>
+      <w:pPr>
+        <w:pStyle w:val="Heading1"/>
+        <w:rPr>
+          <w:lang w:val="es-MX"/>
+        </w:rPr>
+      </w:pPr>
+      <w:bookmarkStart w:id="0" w:name="__RefHeading___Toc3159_1024240431"/>
+      <w:bookmarkEnd w:id="0"/>
+      <w:r>
+        <w:rPr>
+          <w:lang w:val="es-MX"/>
+        </w:rPr>
+        <w:t>Ejemplo 4: Insertar una lista.</w:t>
+      </w:r>
+    </w:p>
+    <w:p>
+      <w:pPr>
+        <w:pStyle w:val="Normal1"/>
+        <w:rPr>
+          <w:lang w:val="es-MX"/>
+        </w:rPr>
+      </w:pPr>
+      <w:r>
+        <w:rPr/>
+        <w:t>Ahora, veamos cómo insertar una lista. Vale la pena mencionar que hasta esta versión solo se puede insertar un solo nivel nivel. En el futuro se incluirán subniveles; y el estilo de la lista debe estar guardado en el documento; en este caso el estilo se llama “lista_no_numerada”. Fíjate que en el documento la variable tiene estilo Normal_sin_sangria, el estilo puesto desde el código será el que domine en el documento final.</w:t>
+      </w:r>
+    </w:p>
+    <w:p>
+      <w:pPr>
+        <w:pStyle w:val="Normal"/>
+        <w:ind w:hanging="0"/>
+        <w:rPr>
+          <w:lang w:val="es-MX"/>
+        </w:rPr>
+      </w:pPr>
+      <w:r>
+        <w:rPr>
+          <w:lang w:val="es-MX"/>
+        </w:rPr>
+      </w:r>
+    </w:p>
+    <w:p>
+      <w:pPr>
+        <w:pStyle w:val="Normalsinsangria"/>
+        <w:rPr/>
+      </w:pPr>
+      <w:r>
+        <w:rPr/>
+        <w:t>&lt;&lt;lista_ejemplo&gt;&gt;</w:t>
+      </w:r>
+    </w:p>
+    <w:p>
+      <w:pPr>
+        <w:pStyle w:val="Heading1"/>
+        <w:rPr>
+          <w:lang w:val="es-MX"/>
+        </w:rPr>
+      </w:pPr>
+      <w:bookmarkStart w:id="1" w:name="__RefHeading___Toc149_3770905155"/>
+      <w:bookmarkStart w:id="2" w:name="_Ref241251931"/>
+      <w:bookmarkEnd w:id="1"/>
+      <w:r>
+        <w:rPr>
+          <w:lang w:val="es-MX"/>
+        </w:rPr>
+        <w:t>Ejemplo 5: Insertar una figura sin título</w:t>
+      </w:r>
+      <w:bookmarkEnd w:id="2"/>
       <w:r>
         <w:rPr>
           <w:lang w:val="es-MX"/>
@@ -139,317 +246,150 @@
     </w:p>
     <w:p>
       <w:pPr>
-        <w:pStyle w:val="Normal"/>
-        <w:jc w:val="end"/>
-        <w:rPr/>
-      </w:pPr>
-      <w:r>
-        <w:rPr/>
+        <w:pStyle w:val="Normal1"/>
+        <w:rPr/>
+      </w:pPr>
+      <w:r>
+        <w:rPr/>
+        <w:t xml:space="preserve">Cuando se inserta una figura; se debe seguir una estructura, la cual se muestra en código. En este ejemplo, se inserta la </w:t>
+      </w:r>
+      <w:r>
+        <w:rPr/>
+        <w:fldChar w:fldCharType="begin"/>
+      </w:r>
+      <w:r>
+        <w:rPr/>
+        <w:instrText xml:space="preserve"> REF _Ref231395923 \h </w:instrText>
+      </w:r>
+      <w:r>
+        <w:rPr/>
+        <w:fldChar w:fldCharType="separate"/>
+      </w:r>
+      <w:r>
+        <w:rPr/>
+        <w:t>Error: Reference source not found</w:t>
+      </w:r>
+      <w:r>
+        <w:rPr/>
+        <w:fldChar w:fldCharType="end"/>
+      </w:r>
+      <w:r>
+        <w:rPr/>
+        <w:t>; la cual ya tiene título (fíjate debajo de la variable, verás que Figura 1 es el bookmark. Para agregar este título, inserta cualquier figura que quieras y presiona click derecho y presiona donde dice “insertar título”; luego borra esa figura y coloca la variable)</w:t>
+      </w:r>
+    </w:p>
+    <w:p>
+      <w:pPr>
+        <w:pStyle w:val="Normal"/>
+        <w:rPr>
+          <w:u w:val="single"/>
+          <w:lang w:val="es-MX"/>
+        </w:rPr>
+      </w:pPr>
+      <w:r>
+        <w:rPr>
+          <w:lang w:val="es-MX"/>
+        </w:rPr>
+        <w:t>&lt;&lt;fig_sintitulo&gt;&gt;</w:t>
+      </w:r>
+    </w:p>
+    <w:p>
+      <w:pPr>
+        <w:pStyle w:val="Carcentrado"/>
+        <w:rPr>
+          <w:lang w:val="es-MX"/>
+        </w:rPr>
+      </w:pPr>
+      <w:r>
+        <w:rPr/>
+        <w:t xml:space="preserve">Figura </w:t>
+      </w:r>
+      <w:r>
+        <w:rPr/>
+        <w:fldChar w:fldCharType="begin"/>
+      </w:r>
+      <w:r>
+        <w:rPr/>
+        <w:instrText xml:space="preserve"> SEQ Figura \* ARABIC </w:instrText>
+      </w:r>
+      <w:r>
+        <w:rPr/>
+        <w:fldChar w:fldCharType="separate"/>
+      </w:r>
+      <w:r>
+        <w:rPr/>
+        <w:t>1</w:t>
+      </w:r>
+      <w:r>
+        <w:rPr/>
+        <w:fldChar w:fldCharType="end"/>
+      </w:r>
+      <w:r>
+        <w:rPr/>
+        <w:t>. Ejemplo de figura. Con la variable del programador &lt;&lt;nombre_del_programador&gt;&gt;</w:t>
+      </w:r>
+    </w:p>
+    <w:p>
+      <w:pPr>
+        <w:pStyle w:val="Normal"/>
+        <w:rPr>
+          <w:lang w:val="es-MX"/>
+        </w:rPr>
+      </w:pPr>
+      <w:r>
+        <w:rPr>
+          <w:lang w:val="es-MX"/>
+        </w:rPr>
+      </w:r>
+    </w:p>
+    <w:p>
+      <w:pPr>
+        <w:pStyle w:val="Normal1"/>
+        <w:rPr/>
+      </w:pPr>
+      <w:r>
+        <w:rPr>
+          <w:lang w:val="es-MX"/>
+        </w:rPr>
+        <w:t>Fíjate que, la variable “fig_sin_titulo” tiene asignado el estilo “Normal” pero; recuerda que el estilo que prevalece será el del código, y en el código le puse estilo “Figura” el cual es un estilo centrado.  Y si te estás preguntando si se pueden poner estilos a todo; la respuesta es que a casi todas las variables les podemos poner un estilo dentro del código. Eso incluye el título de la figura. A este título le puse “Normal” en la plantilla; pero en código user “Carcentrado”. Vale la pena mencionar que en el WORD estilo se llama “Car_centrado” sin embargo, a la hora de llamar a este estilo desde el código; se deben eliminar los “_”.</w:t>
+      </w:r>
+    </w:p>
+    <w:p>
+      <w:pPr>
+        <w:pStyle w:val="Normal"/>
+        <w:rPr>
+          <w:lang w:val="es-MX"/>
+        </w:rPr>
+      </w:pPr>
+      <w:r>
+        <w:rPr>
+          <w:lang w:val="es-MX"/>
+        </w:rPr>
+      </w:r>
+    </w:p>
+    <w:p>
+      <w:pPr>
+        <w:pStyle w:val="Normal1"/>
+        <w:rPr>
+          <w:lang w:val="es-MX"/>
+        </w:rPr>
+      </w:pPr>
+      <w:r>
+        <w:rPr>
+          <w:lang w:val="es-MX"/>
+        </w:rPr>
+        <w:t>Otra cosa importante; para insertar una figura la variable, OBLIGATORIAMENTE, debe comenzar con “fig_”; ejemplo: &lt;&lt;fig_nombrequegustes&gt;&gt;</w:t>
       </w:r>
     </w:p>
     <w:p>
       <w:pPr>
         <w:pStyle w:val="Heading1"/>
-        <w:rPr/>
-      </w:pPr>
-      <w:r>
-        <w:rPr/>
-        <w:t xml:space="preserve">Ejemplo 3: Reemplazar una variable por todo un párrafo y asignarle un estilo a dicho párrafo. </w:t>
-      </w:r>
-    </w:p>
-    <w:p>
-      <w:pPr>
-        <w:pStyle w:val="Normal1"/>
-        <w:rPr/>
-      </w:pPr>
-      <w:r>
-        <w:rPr>
-          <w:lang w:val="es-MX"/>
-        </w:rPr>
-        <w:t xml:space="preserve">En este ejemplo, haremos algo más interesante. Vamos a reemplazar la variable de “párrafos_previos” por </w:t>
-      </w:r>
-      <w:r>
-        <w:rPr>
-          <w:lang w:val="es-MX"/>
-        </w:rPr>
-        <w:t>tres</w:t>
-      </w:r>
-      <w:r>
-        <w:rPr>
-          <w:lang w:val="es-MX"/>
-        </w:rPr>
-        <w:t xml:space="preserve"> párrafos escritos directamente desde el código, donde se usarán las variables “fecha” y “nombre_del_programador”; incluso, pondremos la separación entre ellos.</w:t>
-      </w:r>
-    </w:p>
-    <w:p>
-      <w:pPr>
-        <w:pStyle w:val="Normal"/>
-        <w:rPr>
-          <w:lang w:val="es-MX"/>
-        </w:rPr>
-      </w:pPr>
-      <w:r>
-        <w:rPr>
-          <w:lang w:val="es-MX"/>
-        </w:rPr>
-      </w:r>
-    </w:p>
-    <w:p>
-      <w:pPr>
-        <w:pStyle w:val="Normalsinsangria"/>
-        <w:rPr/>
-      </w:pPr>
-      <w:r>
-        <w:rPr/>
-        <w:t>&lt;&lt;parrafos_previos&gt;&gt;</w:t>
-      </w:r>
-    </w:p>
-    <w:p>
-      <w:pPr>
-        <w:pStyle w:val="Heading1"/>
-        <w:rPr>
-          <w:lang w:val="es-MX"/>
-        </w:rPr>
-      </w:pPr>
-      <w:r>
-        <w:rPr>
-          <w:lang w:val="es-MX"/>
-        </w:rPr>
-        <w:t>Ejemplo 4: Insertar una lista</w:t>
-      </w:r>
-    </w:p>
-    <w:p>
-      <w:pPr>
-        <w:pStyle w:val="Normal1"/>
-        <w:rPr>
-          <w:lang w:val="es-MX"/>
-        </w:rPr>
-      </w:pPr>
-      <w:r>
-        <w:rPr/>
-        <w:t>Ahora, veamos cómo insertar una lista. Vale la pena mencionar que hasta esta versión solo se puede insertar un solo nivel nivel. En el futuro se incluirán subniveles; y el estilo de la lista debe estar guardado en el documento; en este caso el estilo se llama “lista_no_numerada”. Fíjate que en el documento la variable tiene estilo Normal_sin_sangria, el estilo puesto desde el código será el que domine en el documento final.</w:t>
-      </w:r>
-    </w:p>
-    <w:p>
-      <w:pPr>
-        <w:pStyle w:val="Normal"/>
-        <w:ind w:hanging="0"/>
-        <w:rPr>
-          <w:lang w:val="es-MX"/>
-        </w:rPr>
-      </w:pPr>
-      <w:r>
-        <w:rPr>
-          <w:lang w:val="es-MX"/>
-        </w:rPr>
-      </w:r>
-    </w:p>
-    <w:p>
-      <w:pPr>
-        <w:pStyle w:val="Normalsinsangria"/>
-        <w:rPr/>
-      </w:pPr>
-      <w:r>
-        <w:rPr/>
-        <w:t>&lt;&lt;lista_ejemplo&gt;&gt;</w:t>
-      </w:r>
-    </w:p>
-    <w:p>
-      <w:pPr>
-        <w:pStyle w:val="Heading1"/>
-        <w:rPr>
-          <w:lang w:val="es-MX"/>
-        </w:rPr>
-      </w:pPr>
-      <w:bookmarkStart w:id="0" w:name="_Ref241251931"/>
-      <w:r>
-        <w:rPr>
-          <w:lang w:val="es-MX"/>
-        </w:rPr>
-        <w:t>Ejemplo 5: Insertar una figura sin título</w:t>
-      </w:r>
-      <w:bookmarkEnd w:id="0"/>
-    </w:p>
-    <w:p>
-      <w:pPr>
-        <w:pStyle w:val="Normal1"/>
-        <w:rPr/>
-      </w:pPr>
-      <w:r>
-        <w:rPr/>
-        <w:t xml:space="preserve">Cuando se inserta una figura; se debe seguir una estructura, la cual se muestra en código. En este ejemplo, se inserta la </w:t>
-      </w:r>
-      <w:r>
-        <w:rPr/>
-        <w:fldChar w:fldCharType="begin"/>
-      </w:r>
-      <w:r>
-        <w:rPr/>
-        <w:instrText xml:space="preserve"> REF _Ref231395923 \h </w:instrText>
-      </w:r>
-      <w:r>
-        <w:rPr/>
-        <w:fldChar w:fldCharType="separate"/>
-      </w:r>
-      <w:r>
-        <w:rPr/>
-        <w:t>Error: Reference source not found</w:t>
-      </w:r>
-      <w:r>
-        <w:rPr/>
-        <w:fldChar w:fldCharType="end"/>
-      </w:r>
-      <w:r>
-        <w:rPr/>
-        <w:t>; la cual ya tiene título (fíjate debajo de la variable, verás que Figura 1 es el bookmark. Para agregar este título, inserta cualquier figura que quieras y presiona click derecho y presiona donde dice “insertar título”; luego borra esa figura y coloca la variable)</w:t>
-      </w:r>
-    </w:p>
-    <w:p>
-      <w:pPr>
-        <w:pStyle w:val="Normal"/>
-        <w:rPr>
-          <w:u w:val="single"/>
-          <w:lang w:val="es-MX"/>
-        </w:rPr>
-      </w:pPr>
-      <w:r>
-        <w:rPr>
-          <w:lang w:val="es-MX"/>
-        </w:rPr>
-        <w:t>&lt;&lt;fig_sintitulo&gt;&gt;</w:t>
-      </w:r>
-    </w:p>
-    <w:p>
-      <w:pPr>
-        <w:pStyle w:val="Carcentrado"/>
-        <w:rPr>
-          <w:lang w:val="es-MX"/>
-        </w:rPr>
-      </w:pPr>
-      <w:r>
-        <w:rPr/>
-        <w:t xml:space="preserve">Figura </w:t>
-      </w:r>
-      <w:r>
-        <w:rPr/>
-        <w:fldChar w:fldCharType="begin"/>
-      </w:r>
-      <w:r>
-        <w:rPr/>
-        <w:instrText xml:space="preserve"> SEQ Figura \* ARABIC </w:instrText>
-      </w:r>
-      <w:r>
-        <w:rPr/>
-        <w:fldChar w:fldCharType="separate"/>
-      </w:r>
-      <w:r>
-        <w:rPr/>
-        <w:t>1</w:t>
-      </w:r>
-      <w:r>
-        <w:rPr/>
-        <w:fldChar w:fldCharType="end"/>
-      </w:r>
-      <w:r>
-        <w:rPr/>
-        <w:t>. Ejemplo de figura. Con la variable del programador &lt;&lt;nombre_del_programador&gt;&gt;</w:t>
-      </w:r>
-    </w:p>
-    <w:p>
-      <w:pPr>
-        <w:pStyle w:val="Normal"/>
-        <w:rPr>
-          <w:lang w:val="es-MX"/>
-        </w:rPr>
-      </w:pPr>
-      <w:r>
-        <w:rPr>
-          <w:lang w:val="es-MX"/>
-        </w:rPr>
-      </w:r>
-    </w:p>
-    <w:p>
-      <w:pPr>
-        <w:pStyle w:val="Normal1"/>
-        <w:rPr/>
-      </w:pPr>
-      <w:r>
-        <w:rPr>
-          <w:lang w:val="es-MX"/>
-        </w:rPr>
-        <w:t xml:space="preserve">Fíjate que, la variable “fig_sin_titulo” tiene asignado el estilo “Normal” pero; recuerda que el estilo que prevalece será el del código, y en el código le puse estilo “Figura” el cual es un estilo centrado.  Y si te estás preguntando si se pueden poner estilos a todo; la respuesta es que a casi todas las variables les podemos poner un estilo dentro del código. Eso incluye el título de la figura. A este título le puse “Normal” en la plantilla; pero en código user “Carcentrado”. </w:t>
-      </w:r>
-      <w:r>
-        <w:rPr>
-          <w:lang w:val="es-MX"/>
-        </w:rPr>
-        <w:t xml:space="preserve">Vale la pena mencionar que en el WORD estilo se llama </w:t>
-      </w:r>
-      <w:r>
-        <w:rPr>
-          <w:lang w:val="es-MX"/>
-        </w:rPr>
-        <w:t xml:space="preserve">“Car_centrado” </w:t>
-      </w:r>
-      <w:r>
-        <w:rPr>
-          <w:lang w:val="es-MX"/>
-        </w:rPr>
-        <w:t>sin embargo, a la hora de llamar a este estilo desde el código; se deben eliminar los “_”</w:t>
-      </w:r>
-      <w:r>
-        <w:rPr>
-          <w:lang w:val="es-MX"/>
-        </w:rPr>
-        <w:t>.</w:t>
-      </w:r>
-    </w:p>
-    <w:p>
-      <w:pPr>
-        <w:pStyle w:val="Normal"/>
-        <w:rPr>
-          <w:lang w:val="es-MX"/>
-        </w:rPr>
-      </w:pPr>
-      <w:r>
-        <w:rPr>
-          <w:lang w:val="es-MX"/>
-        </w:rPr>
-      </w:r>
-    </w:p>
-    <w:p>
-      <w:pPr>
-        <w:pStyle w:val="Normal1"/>
-        <w:rPr>
-          <w:lang w:val="es-MX"/>
-        </w:rPr>
-      </w:pPr>
-      <w:r>
-        <w:rPr>
-          <w:lang w:val="es-MX"/>
-        </w:rPr>
-        <w:t>Otra cosa importante; para insertar una figura la variable, OBLIGATORIAMENTE, debe comenzar con “fig</w:t>
-      </w:r>
-      <w:r>
-        <w:rPr>
-          <w:lang w:val="es-MX"/>
-        </w:rPr>
-        <w:t>_</w:t>
-      </w:r>
-      <w:r>
-        <w:rPr>
-          <w:lang w:val="es-MX"/>
-        </w:rPr>
-        <w:t>”; ejemplo: &lt;&lt;fig_nombrequegustes&gt;&gt;</w:t>
-      </w:r>
-    </w:p>
-    <w:p>
-      <w:pPr>
-        <w:pStyle w:val="Heading1"/>
-        <w:rPr>
-          <w:lang w:val="es-MX"/>
-        </w:rPr>
-      </w:pPr>
+        <w:rPr>
+          <w:lang w:val="es-MX"/>
+        </w:rPr>
+      </w:pPr>
+      <w:bookmarkStart w:id="3" w:name="__RefHeading___Toc147_3770905155"/>
+      <w:bookmarkEnd w:id="3"/>
       <w:r>
         <w:rPr>
           <w:lang w:val="es-MX"/>
@@ -478,19 +418,20 @@
         <w:rPr>
           <w:lang w:val="es-MX"/>
         </w:rPr>
-        <w:t>A continuación, en la &lt;&lt;reffigura_contitulo&gt;&gt; se muestra la fo</w:t>
-      </w:r>
-      <w:r>
-        <w:rPr>
-          <w:lang w:val="es-MX"/>
-        </w:rPr>
-        <w:t>to de un artista</w:t>
-      </w:r>
-      <w:r>
-        <w:rPr>
-          <w:lang w:val="es-MX"/>
-        </w:rPr>
-        <w:t>.</w:t>
+        <w:t>A continuación, en la &lt;&lt;reffigura_contitulo&gt;&gt; se muestra la foto de una persona.</w:t>
+      </w:r>
+    </w:p>
+    <w:p>
+      <w:pPr>
+        <w:pStyle w:val="Normal1"/>
+        <w:rPr>
+          <w:lang w:val="es-MX"/>
+        </w:rPr>
+      </w:pPr>
+      <w:r>
+        <w:rPr>
+          <w:lang w:val="es-MX"/>
+        </w:rPr>
       </w:r>
     </w:p>
     <w:p>
@@ -500,7 +441,17 @@
       </w:pPr>
       <w:r>
         <w:rPr/>
-        <w:t>&lt;&lt;fig_contitulo&gt;&gt;</w:t>
+        <w:t>&lt;&lt;fig_</w:t>
+      </w:r>
+      <w:r>
+        <w:rPr>
+          <w:lang w:val="es-MX"/>
+        </w:rPr>
+        <w:t>contitulo</w:t>
+      </w:r>
+      <w:r>
+        <w:rPr/>
+        <w:t>&gt;&gt;</w:t>
       </w:r>
     </w:p>
     <w:p>
@@ -611,39 +562,7 @@
           <w:bCs/>
           <w:lang w:val="es-MX"/>
         </w:rPr>
-        <w:t xml:space="preserve"> si el título tiene más de 1</w:t>
-      </w:r>
-      <w:r>
-        <w:rPr>
-          <w:b/>
-          <w:bCs/>
-          <w:lang w:val="es-MX"/>
-        </w:rPr>
-        <w:t>2</w:t>
-      </w:r>
-      <w:r>
-        <w:rPr>
-          <w:b/>
-          <w:bCs/>
-          <w:lang w:val="es-MX"/>
-        </w:rPr>
-        <w:t>0 letras; se usará el estilo “Carjustificado”, si la longitud del título es de menos de 1</w:t>
-      </w:r>
-      <w:r>
-        <w:rPr>
-          <w:b/>
-          <w:bCs/>
-          <w:lang w:val="es-MX"/>
-        </w:rPr>
-        <w:t>2</w:t>
-      </w:r>
-      <w:r>
-        <w:rPr>
-          <w:b/>
-          <w:bCs/>
-          <w:lang w:val="es-MX"/>
-        </w:rPr>
-        <w:t>0 letras, se usará el estilo “Carcentrado”</w:t>
+        <w:t xml:space="preserve"> si el título tiene más de 120 letras; se usará el estilo “Carjustificado”, si la longitud del título es de menos de 120 letras, se usará el estilo “Carcentrado”</w:t>
       </w:r>
       <w:r>
         <w:rPr>
@@ -651,15 +570,7 @@
           <w:bCs w:val="false"/>
           <w:lang w:val="es-MX"/>
         </w:rPr>
-        <w:t xml:space="preserve">. </w:t>
-      </w:r>
-      <w:r>
-        <w:rPr>
-          <w:b w:val="false"/>
-          <w:bCs w:val="false"/>
-          <w:lang w:val="es-MX"/>
-        </w:rPr>
-        <w:t>Puedes hacer la verificación de que el estilo del título de la figura si cambia cuando usas un título con menos caracteres.</w:t>
+        <w:t>. Puedes hacer la verificación de que el estilo del título de la figura si cambia cuando usas un título con menos caracteres.</w:t>
       </w:r>
     </w:p>
     <w:p>
@@ -683,86 +594,199 @@
           <w:lang w:val="es-MX"/>
         </w:rPr>
       </w:pPr>
-      <w:bookmarkStart w:id="1" w:name="__RefHeading___Toc1025_2736757441"/>
-      <w:bookmarkEnd w:id="1"/>
-      <w:r>
-        <w:rPr>
-          <w:lang w:val="es-MX"/>
-        </w:rPr>
-        <w:t>Ejemplo 7: Rellenar tabla existente</w:t>
-      </w:r>
-    </w:p>
-    <w:p>
-      <w:pPr>
-        <w:pStyle w:val="Normal1"/>
-        <w:rPr/>
-      </w:pPr>
-      <w:r>
-        <w:rPr>
-          <w:lang w:val="es-MX"/>
-        </w:rPr>
-        <w:t xml:space="preserve">En este </w:t>
-      </w:r>
-      <w:r>
-        <w:rPr>
-          <w:lang w:val="es-MX"/>
-        </w:rPr>
-        <w:t>apartado realizaremos varios ejemplos en donde</w:t>
-      </w:r>
-      <w:r>
-        <w:rPr>
-          <w:lang w:val="es-MX"/>
-        </w:rPr>
-        <w:t xml:space="preserve"> vamos a rellenar tabla</w:t>
-      </w:r>
-      <w:r>
-        <w:rPr>
-          <w:lang w:val="es-MX"/>
-        </w:rPr>
-        <w:t>s</w:t>
-      </w:r>
-      <w:r>
-        <w:rPr>
-          <w:lang w:val="es-MX"/>
-        </w:rPr>
-        <w:t xml:space="preserve"> que ya existe</w:t>
-      </w:r>
-      <w:r>
-        <w:rPr>
-          <w:lang w:val="es-MX"/>
-        </w:rPr>
-        <w:t>n</w:t>
-      </w:r>
-      <w:r>
-        <w:rPr>
-          <w:lang w:val="es-MX"/>
-        </w:rPr>
-        <w:t xml:space="preserve"> </w:t>
-      </w:r>
-      <w:r>
-        <w:rPr>
-          <w:lang w:val="es-MX"/>
-        </w:rPr>
-        <w:t>en la plantill</w:t>
-      </w:r>
-      <w:r>
-        <w:rPr>
-          <w:lang w:val="es-MX"/>
-        </w:rPr>
-        <w:t>a para probar toda la potencia de EZSNAKE para editar y crear tablas.</w:t>
-      </w:r>
-    </w:p>
-    <w:p>
-      <w:pPr>
-        <w:pStyle w:val="Normal"/>
-        <w:rPr>
-          <w:lang w:val="es-MX"/>
-        </w:rPr>
-      </w:pPr>
-      <w:r>
-        <w:rPr>
-          <w:lang w:val="es-MX"/>
-        </w:rPr>
+      <w:bookmarkStart w:id="4" w:name="__RefHeading___Toc1025_2736757441_Copy_1"/>
+      <w:bookmarkEnd w:id="4"/>
+      <w:r>
+        <w:rPr/>
+        <w:t xml:space="preserve">Ejemplo 7: </w:t>
+      </w:r>
+      <w:r>
+        <w:rPr/>
+        <w:t>Insertar varias figuras y poner las referencias.</w:t>
+      </w:r>
+    </w:p>
+    <w:p>
+      <w:pPr>
+        <w:pStyle w:val="Normal"/>
+        <w:spacing w:lineRule="auto" w:line="240"/>
+        <w:rPr>
+          <w:lang w:val="es-MX"/>
+        </w:rPr>
+      </w:pPr>
+      <w:r>
+        <w:rPr>
+          <w:lang w:val="es-MX"/>
+        </w:rPr>
+        <w:t xml:space="preserve">En este ejemplo vamos a ver cómo se insertan varias figuras y sus referencias cruzadas </w:t>
+      </w:r>
+      <w:r>
+        <w:rPr>
+          <w:lang w:val="es-MX"/>
+        </w:rPr>
+        <w:t>y mezclando diferentes estilos.</w:t>
+      </w:r>
+    </w:p>
+    <w:p>
+      <w:pPr>
+        <w:pStyle w:val="Normal"/>
+        <w:spacing w:lineRule="auto" w:line="240"/>
+        <w:rPr>
+          <w:lang w:val="es-MX"/>
+        </w:rPr>
+      </w:pPr>
+      <w:r>
+        <w:rPr>
+          <w:lang w:val="es-MX"/>
+        </w:rPr>
+      </w:r>
+    </w:p>
+    <w:p>
+      <w:pPr>
+        <w:pStyle w:val="Normal"/>
+        <w:spacing w:lineRule="auto" w:line="240"/>
+        <w:rPr>
+          <w:lang w:val="es-MX"/>
+        </w:rPr>
+      </w:pPr>
+      <w:r>
+        <w:rPr>
+          <w:lang w:val="es-MX"/>
+        </w:rPr>
+        <w:t>De la &lt;&lt;reffigura_variasfiguras&gt;&gt; se muetran varias caras de personajes.</w:t>
+      </w:r>
+    </w:p>
+    <w:p>
+      <w:pPr>
+        <w:pStyle w:val="Normal"/>
+        <w:spacing w:lineRule="auto" w:line="240"/>
+        <w:rPr>
+          <w:lang w:val="es-MX"/>
+        </w:rPr>
+      </w:pPr>
+      <w:r>
+        <w:rPr>
+          <w:lang w:val="es-MX"/>
+        </w:rPr>
+      </w:r>
+    </w:p>
+    <w:p>
+      <w:pPr>
+        <w:pStyle w:val="Normal"/>
+        <w:spacing w:lineRule="auto" w:line="240"/>
+        <w:rPr>
+          <w:lang w:val="es-MX"/>
+        </w:rPr>
+      </w:pPr>
+      <w:r>
+        <w:rPr>
+          <w:lang w:val="es-MX"/>
+        </w:rPr>
+        <w:t>&lt;&lt;fig_variasfiguras&gt;&gt;</w:t>
+      </w:r>
+    </w:p>
+    <w:p>
+      <w:pPr>
+        <w:pStyle w:val="Normal"/>
+        <w:spacing w:lineRule="auto" w:line="240"/>
+        <w:rPr>
+          <w:lang w:val="es-MX"/>
+        </w:rPr>
+      </w:pPr>
+      <w:r>
+        <w:rPr>
+          <w:lang w:val="es-MX"/>
+        </w:rPr>
+      </w:r>
+    </w:p>
+    <w:p>
+      <w:pPr>
+        <w:pStyle w:val="Normal"/>
+        <w:spacing w:lineRule="auto" w:line="240"/>
+        <w:rPr>
+          <w:lang w:val="es-MX"/>
+        </w:rPr>
+      </w:pPr>
+      <w:r>
+        <w:rPr>
+          <w:lang w:val="es-MX"/>
+        </w:rPr>
+        <w:t>Ahora mostraré que se pueden insertar referencias y que las referencias cruzadas a otra sección se mantienen (</w:t>
+      </w:r>
+      <w:r>
+        <w:rPr>
+          <w:lang w:val="es-MX"/>
+        </w:rPr>
+        <w:fldChar w:fldCharType="begin"/>
+      </w:r>
+      <w:r>
+        <w:rPr>
+          <w:lang w:val="es-MX"/>
+        </w:rPr>
+        <w:instrText xml:space="preserve"> REF __RefHeading___Toc3159_1024240431 \h </w:instrText>
+      </w:r>
+      <w:r>
+        <w:rPr>
+          <w:lang w:val="es-MX"/>
+        </w:rPr>
+        <w:fldChar w:fldCharType="separate"/>
+      </w:r>
+      <w:r>
+        <w:rPr>
+          <w:lang w:val="es-MX"/>
+        </w:rPr>
+        <w:t>Ejemplo 4: Insertar una lista.</w:t>
+      </w:r>
+      <w:r>
+        <w:rPr>
+          <w:lang w:val="es-MX"/>
+        </w:rPr>
+        <w:fldChar w:fldCharType="end"/>
+      </w:r>
+      <w:r>
+        <w:rPr>
+          <w:lang w:val="es-MX"/>
+        </w:rPr>
+        <w:t>).</w:t>
+      </w:r>
+    </w:p>
+    <w:p>
+      <w:pPr>
+        <w:pStyle w:val="Heading1"/>
+        <w:rPr>
+          <w:lang w:val="es-MX"/>
+        </w:rPr>
+      </w:pPr>
+      <w:bookmarkStart w:id="5" w:name="__RefHeading___Toc1025_2736757441"/>
+      <w:bookmarkEnd w:id="5"/>
+      <w:r>
+        <w:rPr>
+          <w:lang w:val="es-MX"/>
+        </w:rPr>
+        <w:t xml:space="preserve">Ejemplo </w:t>
+      </w:r>
+      <w:r>
+        <w:rPr>
+          <w:lang w:val="es-MX"/>
+        </w:rPr>
+        <w:t>8</w:t>
+      </w:r>
+      <w:r>
+        <w:rPr>
+          <w:lang w:val="es-MX"/>
+        </w:rPr>
+        <w:t>: Rellenar tabla existente.</w:t>
+      </w:r>
+    </w:p>
+    <w:p>
+      <w:pPr>
+        <w:pStyle w:val="Normal1"/>
+        <w:rPr/>
+      </w:pPr>
+      <w:r>
+        <w:rPr>
+          <w:lang w:val="es-MX"/>
+        </w:rPr>
+        <w:t>En este apartado realizaremos varios ejemplos en donde vamos a rellenar tablas que ya existen en la plantilla para probar toda la potencia de EZSNAKE para editar y crear tablas.</w:t>
       </w:r>
     </w:p>
     <w:p>
@@ -772,7 +796,15 @@
       </w:pPr>
       <w:r>
         <w:rPr/>
-        <w:t>Ejemplo 7.1: Rellenar tabla y editar algunas propiedades de esta</w:t>
+        <w:t xml:space="preserve">Ejemplo </w:t>
+      </w:r>
+      <w:r>
+        <w:rPr/>
+        <w:t>8</w:t>
+      </w:r>
+      <w:r>
+        <w:rPr/>
+        <w:t>.1: Rellenar tabla y editar algunas propiedades de esta.</w:t>
       </w:r>
     </w:p>
     <w:p>
@@ -796,31 +828,7 @@
       </w:pPr>
       <w:r>
         <w:rPr/>
-        <w:t>V</w:t>
-      </w:r>
-      <w:r>
-        <w:rPr/>
-        <w:t xml:space="preserve">amos a editar </w:t>
-      </w:r>
-      <w:r>
-        <w:rPr/>
-        <w:t xml:space="preserve">la </w:t>
-      </w:r>
-      <w:r>
-        <w:rPr/>
-        <w:t>“</w:t>
-      </w:r>
-      <w:r>
-        <w:rPr/>
-        <w:t>INSERTA REFERENCIA A LA TABLA ACÁ”; rellenandola</w:t>
-      </w:r>
-      <w:r>
-        <w:rPr/>
-        <w:t xml:space="preserve"> con tres filas: en la última fila de la columna edad se colocará un color de fondo; además la columna edad tendrá un estilo justificado; mientas que las otras dos columnas tendrán estilo centrado. Para poder agregar estilos del texto, este debe existir dentro de la plantilla (vea en estilos: </w:t>
-      </w:r>
-      <w:r>
-        <w:rPr/>
-        <w:t xml:space="preserve">tabla_encabezado_centrado_blanco,  tabla_encabezado_centrado_negro, tabla_text_centrado,  tabla_text_justificado). </w:t>
+        <w:t xml:space="preserve">Vamos a editar la “INSERTA REFERENCIA A LA TABLA ACÁ”; rellenandola con tres filas: en la última fila de la columna edad se colocará un color de fondo; además la columna edad tendrá un estilo justificado; mientas que las otras dos columnas tendrán estilo centrado. Para poder agregar estilos del texto, este debe existir dentro de la plantilla (vea en estilos: tabla_encabezado_centrado_blanco,  tabla_encabezado_centrado_negro, tabla_text_centrado,  tabla_text_justificado). </w:t>
       </w:r>
     </w:p>
     <w:p>
@@ -978,15 +986,7 @@
             </w:pPr>
             <w:r>
               <w:rPr/>
-              <w:t>&lt;&lt;</w:t>
-            </w:r>
-            <w:r>
-              <w:rPr/>
-              <w:t>editartabla_tabla_1</w:t>
-            </w:r>
-            <w:r>
-              <w:rPr/>
-              <w:t>&gt;&gt;</w:t>
+              <w:t>&lt;&lt;editartabla_tabla_1&gt;&gt;</w:t>
             </w:r>
           </w:p>
         </w:tc>
@@ -1047,21 +1047,48 @@
     </w:p>
     <w:p>
       <w:pPr>
-        <w:pStyle w:val="Normal1"/>
-        <w:rPr/>
-      </w:pPr>
-      <w:r>
-        <w:rPr/>
-      </w:r>
-    </w:p>
-    <w:p>
-      <w:pPr>
-        <w:pStyle w:val="Normal1"/>
-        <w:rPr/>
-      </w:pPr>
-      <w:r>
-        <w:rPr/>
-        <w:t>Ahora vamos a rellenar esta otra tabla pero agrupando valores. Vamos a hacer una combnación de la primera columna cuando hayan valores repetidos consecutivos</w:t>
+        <w:pStyle w:val="Heading2"/>
+        <w:ind w:hanging="0" w:start="0"/>
+        <w:rPr>
+          <w:lang w:val="es-MX"/>
+        </w:rPr>
+      </w:pPr>
+      <w:r>
+        <w:rPr>
+          <w:lang w:val="es-MX"/>
+        </w:rPr>
+        <w:t xml:space="preserve">Ejemplo </w:t>
+      </w:r>
+      <w:r>
+        <w:rPr>
+          <w:lang w:val="es-MX"/>
+        </w:rPr>
+        <w:t>8</w:t>
+      </w:r>
+      <w:r>
+        <w:rPr>
+          <w:lang w:val="es-MX"/>
+        </w:rPr>
+        <w:t>.2: Rellenar tabla y agrupar valores.</w:t>
+      </w:r>
+    </w:p>
+    <w:p>
+      <w:pPr>
+        <w:pStyle w:val="Normal1"/>
+        <w:rPr/>
+      </w:pPr>
+      <w:r>
+        <w:rPr/>
+      </w:r>
+    </w:p>
+    <w:p>
+      <w:pPr>
+        <w:pStyle w:val="Normal1"/>
+        <w:rPr/>
+      </w:pPr>
+      <w:r>
+        <w:rPr/>
+        <w:t>Ahora vamos a rellenar esta otra tabla pero agrupando valores. Vamos a hacer una combnación de la primera columna cuando hayan valores repetidos consecutivos.</w:t>
       </w:r>
     </w:p>
     <w:p>
@@ -1195,19 +1222,7 @@
             </w:pPr>
             <w:r>
               <w:rPr/>
-              <w:t>&lt;&lt;</w:t>
-            </w:r>
-            <w:r>
-              <w:rPr/>
-              <w:t>editartabla_tabla_</w:t>
-            </w:r>
-            <w:r>
-              <w:rPr/>
-              <w:t>2</w:t>
-            </w:r>
-            <w:r>
-              <w:rPr/>
-              <w:t>&gt;&gt;</w:t>
+              <w:t>&lt;&lt;editartabla_tabla_2&gt;&gt;</w:t>
             </w:r>
           </w:p>
         </w:tc>
@@ -1269,23 +1284,85 @@
           <w:lang w:val="es-MX"/>
         </w:rPr>
       </w:pPr>
-      <w:r>
-        <w:rPr>
-          <w:lang w:val="es-MX"/>
-        </w:rPr>
-        <w:t>Ejemplo 8: Reemplazar una variable por una tabla con referencia o sin referencia</w:t>
-      </w:r>
-    </w:p>
-    <w:p>
-      <w:pPr>
-        <w:pStyle w:val="Normal1"/>
-        <w:rPr>
-          <w:lang w:val="es-MX"/>
-        </w:rPr>
-      </w:pPr>
-      <w:r>
-        <w:rPr/>
-        <w:t>Las tablas y las figuras funcionan de manera similar a las figuras; es decir, puedes tener la referencia previamente insertada y el título preparado (caso del ejemplo 5); o puedes construir referencia y título desde cero. Igualmente; puedes elegir el estilo del título y de la tabla en general. En este ejemplo solo haremos la construcción total de la tabla pues es el más complejo.</w:t>
+      <w:bookmarkStart w:id="6" w:name="__RefHeading___Toc3157_1024240431"/>
+      <w:bookmarkEnd w:id="6"/>
+      <w:r>
+        <w:rPr>
+          <w:lang w:val="es-MX"/>
+        </w:rPr>
+        <w:t xml:space="preserve">Ejemplo </w:t>
+      </w:r>
+      <w:r>
+        <w:rPr>
+          <w:lang w:val="es-MX"/>
+        </w:rPr>
+        <w:t>9</w:t>
+      </w:r>
+      <w:r>
+        <w:rPr>
+          <w:lang w:val="es-MX"/>
+        </w:rPr>
+        <w:t>: Reemplazar una variable por una tabla con referencia o sin referencia.</w:t>
+      </w:r>
+    </w:p>
+    <w:p>
+      <w:pPr>
+        <w:pStyle w:val="Normal1"/>
+        <w:rPr>
+          <w:lang w:val="es-MX"/>
+        </w:rPr>
+      </w:pPr>
+      <w:r>
+        <w:rPr/>
+        <w:t xml:space="preserve">Las tablas y las figuras funcionan de manera similar a las figuras; es decir, puedes tener la referencia previamente insertada y el título preparado (caso del </w:t>
+      </w:r>
+      <w:r>
+        <w:rPr/>
+        <w:fldChar w:fldCharType="begin"/>
+      </w:r>
+      <w:r>
+        <w:rPr/>
+        <w:instrText xml:space="preserve"> REF __RefHeading___Toc149_3770905155 \h </w:instrText>
+      </w:r>
+      <w:r>
+        <w:rPr/>
+        <w:fldChar w:fldCharType="separate"/>
+      </w:r>
+      <w:r>
+        <w:rPr/>
+        <w:t>Ejemplo 5: Insertar una figura sin título.</w:t>
+      </w:r>
+      <w:r>
+        <w:rPr/>
+        <w:fldChar w:fldCharType="end"/>
+      </w:r>
+      <w:r>
+        <w:rPr/>
+        <w:t xml:space="preserve">); o puedes construir referencia y título desde cero (de forma similar al </w:t>
+      </w:r>
+      <w:r>
+        <w:rPr/>
+        <w:fldChar w:fldCharType="begin"/>
+      </w:r>
+      <w:r>
+        <w:rPr/>
+        <w:instrText xml:space="preserve"> REF __RefHeading___Toc147_3770905155 \h </w:instrText>
+      </w:r>
+      <w:r>
+        <w:rPr/>
+        <w:fldChar w:fldCharType="separate"/>
+      </w:r>
+      <w:r>
+        <w:rPr/>
+        <w:t>Ejemplo 6: Insertar una figura con título y agregar la referencia en un párrafo.</w:t>
+      </w:r>
+      <w:r>
+        <w:rPr/>
+        <w:fldChar w:fldCharType="end"/>
+      </w:r>
+      <w:r>
+        <w:rPr/>
+        <w:t xml:space="preserve">). En el código podrás ver cómo se construye una tabla desde cero.  </w:t>
       </w:r>
     </w:p>
     <w:p>
@@ -1304,6 +1381,18 @@
     </w:p>
     <w:p>
       <w:pPr>
+        <w:pStyle w:val="Normal1"/>
+        <w:rPr/>
+      </w:pPr>
+      <w:r>
+        <w:rPr>
+          <w:lang w:val="es-MX"/>
+        </w:rPr>
+        <w:t>En la tabla &lt;&lt;refnuevatabla_tablacreadadesdecero&gt;&gt; vamos a insertar un título con un formato elegido desde el código (Car_centrado); recuerda que el estilo debe existir en la plantilla para que pueda ser usado. Para insertar una referencia a una tabla, esta debe comenzar con la palabra clave “reftabla_” seguido del nombre que desees para identificar la tabla. Y para crear la tabla se debe usar la palabra clave “refnuevatabla_” seguido del nombre de la tabla. Es muy importante que el nombre de la tabla sea el mismo que en la referencia.</w:t>
+      </w:r>
+    </w:p>
+    <w:p>
+      <w:pPr>
         <w:pStyle w:val="Normal"/>
         <w:spacing w:lineRule="auto" w:line="240"/>
         <w:rPr>
@@ -1314,7 +1403,16 @@
         <w:rPr>
           <w:lang w:val="es-MX"/>
         </w:rPr>
-        <w:t>Ahora inserto una tabla con su referencia &lt;&lt;reftabla_tabla1&gt;&gt;</w:t>
+      </w:r>
+    </w:p>
+    <w:p>
+      <w:pPr>
+        <w:pStyle w:val="Normal1"/>
+        <w:rPr/>
+      </w:pPr>
+      <w:r>
+        <w:rPr/>
+        <w:t>En esta tabla; vamos a colocar un header con fondo de color azul RGB = [50, 101, 164] igual que las tablas anteriores y letra de color blanco (tal como se indica en el formato tabla_header_centrado_blanco)</w:t>
       </w:r>
     </w:p>
     <w:p>
@@ -1342,20 +1440,62 @@
         <w:rPr>
           <w:lang w:val="es-MX"/>
         </w:rPr>
-        <w:t>&lt;&lt;nuevatabla_tabla1&gt;&gt;</w:t>
-      </w:r>
-    </w:p>
-    <w:p>
-      <w:pPr>
-        <w:pStyle w:val="Normal"/>
-        <w:rPr>
-          <w:lang w:val="es-MX"/>
-        </w:rPr>
-      </w:pPr>
-      <w:r>
-        <w:rPr>
-          <w:lang w:val="es-MX"/>
-        </w:rPr>
+        <w:t>&lt;&lt;nuevatabla_tablacreadadesdecero&gt;&gt;</w:t>
+      </w:r>
+    </w:p>
+    <w:p>
+      <w:pPr>
+        <w:pStyle w:val="Normal"/>
+        <w:rPr>
+          <w:lang w:val="es-MX"/>
+        </w:rPr>
+      </w:pPr>
+      <w:r>
+        <w:rPr>
+          <w:lang w:val="es-MX"/>
+        </w:rPr>
+      </w:r>
+    </w:p>
+    <w:p>
+      <w:pPr>
+        <w:pStyle w:val="Normal1"/>
+        <w:rPr/>
+      </w:pPr>
+      <w:r>
+        <w:rPr/>
+        <w:t xml:space="preserve">Vuelvo a insertart la referencia a la &lt;&lt;refnuevatabla_tablacreadadesdecero&gt;&gt; para mostraar que se puede reutilizar las veces que sea necesaria </w:t>
+      </w:r>
+      <w:r>
+        <w:rPr/>
+        <w:t>y que no borra referencias cruzadas a otras secciones (</w:t>
+      </w:r>
+      <w:r>
+        <w:rPr/>
+        <w:fldChar w:fldCharType="begin"/>
+      </w:r>
+      <w:r>
+        <w:rPr/>
+        <w:instrText xml:space="preserve"> REF __RefHeading___Toc3157_1024240431 \h </w:instrText>
+      </w:r>
+      <w:r>
+        <w:rPr/>
+        <w:fldChar w:fldCharType="separate"/>
+      </w:r>
+      <w:r>
+        <w:rPr/>
+        <w:t>Ejemplo 9: Reemplazar una variable por una tabla con referencia o sin referencia.</w:t>
+      </w:r>
+      <w:r>
+        <w:rPr/>
+        <w:fldChar w:fldCharType="end"/>
+      </w:r>
+      <w:r>
+        <w:rPr/>
+        <w:t>)</w:t>
+      </w:r>
+      <w:r>
+        <w:rPr/>
+        <w:t>.</w:t>
       </w:r>
     </w:p>
     <w:p>
@@ -1369,81 +1509,215 @@
         <w:rPr>
           <w:lang w:val="es-MX"/>
         </w:rPr>
-        <w:t>Ejemplo 9: Agregar toda una sección.</w:t>
-      </w:r>
-    </w:p>
-    <w:p>
-      <w:pPr>
-        <w:pStyle w:val="Normal"/>
-        <w:rPr>
-          <w:lang w:val="es-MX"/>
-        </w:rPr>
-      </w:pPr>
-      <w:r>
-        <w:rPr>
-          <w:lang w:val="es-MX"/>
-        </w:rPr>
-      </w:r>
-    </w:p>
-    <w:p>
-      <w:pPr>
-        <w:pStyle w:val="Normal"/>
-        <w:rPr>
-          <w:lang w:val="es-MX"/>
-        </w:rPr>
-      </w:pPr>
-      <w:r>
-        <w:rPr>
-          <w:lang w:val="es-MX"/>
-        </w:rPr>
-        <w:t>Como última parte pondré una sección con todo lo anterior.</w:t>
-      </w:r>
-    </w:p>
-    <w:p>
-      <w:pPr>
-        <w:pStyle w:val="Normal"/>
-        <w:rPr>
-          <w:lang w:val="es-MX"/>
-        </w:rPr>
-      </w:pPr>
-      <w:r>
-        <w:rPr>
-          <w:lang w:val="es-MX"/>
-        </w:rPr>
-      </w:r>
-    </w:p>
-    <w:p>
-      <w:pPr>
-        <w:pStyle w:val="Normal"/>
-        <w:rPr/>
-      </w:pPr>
-      <w:r>
-        <w:rPr/>
-        <w:t>&lt;&lt;sec_prueba&gt;&gt;</w:t>
-      </w:r>
-    </w:p>
-    <w:p>
-      <w:pPr>
-        <w:pStyle w:val="Normal"/>
-        <w:rPr/>
-      </w:pPr>
-      <w:r>
-        <w:rPr/>
-      </w:r>
-    </w:p>
-    <w:p>
-      <w:pPr>
-        <w:pStyle w:val="Normal"/>
-        <w:rPr/>
-      </w:pPr>
-      <w:r>
-        <w:rPr/>
-      </w:r>
-    </w:p>
-    <w:p>
-      <w:pPr>
-        <w:pStyle w:val="Normal"/>
-        <w:ind w:hanging="0" w:start="0"/>
+        <w:t xml:space="preserve">Ejemplo </w:t>
+      </w:r>
+      <w:r>
+        <w:rPr>
+          <w:lang w:val="es-MX"/>
+        </w:rPr>
+        <w:t>10</w:t>
+      </w:r>
+      <w:r>
+        <w:rPr>
+          <w:lang w:val="es-MX"/>
+        </w:rPr>
+        <w:t>: Agregar una sección.</w:t>
+      </w:r>
+    </w:p>
+    <w:p>
+      <w:pPr>
+        <w:pStyle w:val="Normal"/>
+        <w:rPr>
+          <w:lang w:val="es-MX"/>
+        </w:rPr>
+      </w:pPr>
+      <w:r>
+        <w:rPr>
+          <w:lang w:val="es-MX"/>
+        </w:rPr>
+      </w:r>
+    </w:p>
+    <w:p>
+      <w:pPr>
+        <w:pStyle w:val="Normal1"/>
+        <w:rPr/>
+      </w:pPr>
+      <w:r>
+        <w:rPr/>
+        <w:t xml:space="preserve">Ahora vamos aprender a crear secciones. Una sección son un conjunto de párrafos, figuras, tablas acomodados a conveniencia directamente desde el código. El orden peude ser como elija el usuario. La verdadera utilidad de las secciones radica en generar de forma automática partes del documento que deben mantener la misma estructura cuyo contenido va cambiando para cada parte. Por ejemplo, supongamos que se desea reportar por día, la cantidad de personas entrevistadas. </w:t>
+      </w:r>
+    </w:p>
+    <w:p>
+      <w:pPr>
+        <w:pStyle w:val="Normal1"/>
+        <w:rPr/>
+      </w:pPr>
+      <w:r>
+        <w:rPr/>
+      </w:r>
+    </w:p>
+    <w:p>
+      <w:pPr>
+        <w:pStyle w:val="Normal1"/>
+        <w:rPr/>
+      </w:pPr>
+      <w:r>
+        <w:rPr/>
+        <w:t>En este ejemplo se entiende que: Cada título debe ser la fecha en que se hicieron entrevistas, el párrafo debe decir cuantas personas se entrevistaron, debe haber una lista de los nombres y finalmente las fotos de cada participante (y que el título de la foto sea el nombre del entrevistado):</w:t>
+      </w:r>
+    </w:p>
+    <w:p>
+      <w:pPr>
+        <w:pStyle w:val="Normal1"/>
+        <w:rPr/>
+      </w:pPr>
+      <w:r>
+        <w:rPr/>
+      </w:r>
+    </w:p>
+    <w:p>
+      <w:pPr>
+        <w:pStyle w:val="Normal1"/>
+        <w:rPr/>
+      </w:pPr>
+      <w:r>
+        <w:rPr/>
+        <w:t>- Título (con estilo en negritas).</w:t>
+      </w:r>
+    </w:p>
+    <w:p>
+      <w:pPr>
+        <w:pStyle w:val="Normal1"/>
+        <w:rPr/>
+      </w:pPr>
+      <w:r>
+        <w:rPr/>
+        <w:t>- Un párrafo (estilo normal).</w:t>
+      </w:r>
+    </w:p>
+    <w:p>
+      <w:pPr>
+        <w:pStyle w:val="Normal1"/>
+        <w:rPr/>
+      </w:pPr>
+      <w:r>
+        <w:rPr/>
+        <w:t>- Figuras con títulos.</w:t>
+      </w:r>
+    </w:p>
+    <w:p>
+      <w:pPr>
+        <w:pStyle w:val="Normal1"/>
+        <w:rPr>
+          <w:lang w:val="es-MX"/>
+        </w:rPr>
+      </w:pPr>
+      <w:r>
+        <w:rPr>
+          <w:lang w:val="es-MX"/>
+        </w:rPr>
+      </w:r>
+    </w:p>
+    <w:p>
+      <w:pPr>
+        <w:pStyle w:val="Normal1"/>
+        <w:rPr>
+          <w:lang w:val="es-MX"/>
+        </w:rPr>
+      </w:pPr>
+      <w:r>
+        <w:rPr>
+          <w:lang w:val="es-MX"/>
+        </w:rPr>
+        <w:t>Para ver el verdaero poder de EZSNAKE vamos a usar una base de datos de entrevistas llamado entrevistas.xlsx y directo desde el código vamos filtrar y ha hacer los ciclos para que la sección se escriba sola para tantos días tengamos registrados. Así que comencemos!</w:t>
+      </w:r>
+    </w:p>
+    <w:p>
+      <w:pPr>
+        <w:pStyle w:val="Normal1"/>
+        <w:rPr>
+          <w:lang w:val="es-MX"/>
+        </w:rPr>
+      </w:pPr>
+      <w:r>
+        <w:rPr>
+          <w:lang w:val="es-MX"/>
+        </w:rPr>
+      </w:r>
+    </w:p>
+    <w:p>
+      <w:pPr>
+        <w:pStyle w:val="Normal1"/>
+        <w:rPr>
+          <w:lang w:val="es-MX"/>
+        </w:rPr>
+      </w:pPr>
+      <w:r>
+        <w:rPr>
+          <w:lang w:val="es-MX"/>
+        </w:rPr>
+      </w:r>
+    </w:p>
+    <w:p>
+      <w:pPr>
+        <w:pStyle w:val="Normal1"/>
+        <w:rPr/>
+      </w:pPr>
+      <w:r>
+        <w:rPr/>
+        <w:t>&lt;&lt;sec_ejemplo&gt;&gt;</w:t>
+      </w:r>
+    </w:p>
+    <w:p>
+      <w:pPr>
+        <w:pStyle w:val="Normal"/>
+        <w:rPr/>
+      </w:pPr>
+      <w:r>
+        <w:rPr/>
+      </w:r>
+    </w:p>
+    <w:p>
+      <w:pPr>
+        <w:pStyle w:val="Normal"/>
+        <w:rPr/>
+      </w:pPr>
+      <w:r>
+        <w:rPr/>
+      </w:r>
+    </w:p>
+    <w:p>
+      <w:pPr>
+        <w:pStyle w:val="Normal"/>
+        <w:rPr/>
+      </w:pPr>
+      <w:r>
+        <w:rPr/>
+        <w:t>Ahora puedes comparar como cambian los párrafos en función de la cantidad de entrevistados por día. Hacer los párrafos desde el código permite muchas ventajas que una plantilla estática no permite.</w:t>
+      </w:r>
+    </w:p>
+    <w:p>
+      <w:pPr>
+        <w:pStyle w:val="Normal"/>
+        <w:rPr/>
+      </w:pPr>
+      <w:r>
+        <w:rPr/>
+      </w:r>
+    </w:p>
+    <w:p>
+      <w:pPr>
+        <w:pStyle w:val="Normal"/>
+        <w:rPr/>
+      </w:pPr>
+      <w:r>
+        <w:rPr/>
+        <w:t>Esto es todo por este tutorial, espero que te haya gustado y que te sirva mucho en tus procesos de automatización.</w:t>
+      </w:r>
+    </w:p>
+    <w:p>
+      <w:pPr>
+        <w:pStyle w:val="Normal"/>
         <w:rPr/>
       </w:pPr>
       <w:r>
@@ -2131,6 +2405,7 @@
     <w:rsid w:val="00853c36"/>
     <w:pPr>
       <w:widowControl/>
+      <w:suppressAutoHyphens w:val="true"/>
       <w:bidi w:val="0"/>
       <w:spacing w:lineRule="auto" w:line="360" w:before="0" w:after="0"/>
       <w:ind w:firstLine="425"/>

</xml_diff>